<commit_message>
docs: update schema reference, blueprint, and document standards for Phase 21
Co-authored-by: Cursor <cursoragent@cursor.com>
</commit_message>
<xml_diff>
--- a/Supthavee_ERP_Document_Standards.docx
+++ b/Supthavee_ERP_Document_Standards.docx
@@ -6,28 +6,18 @@
       <w:pPr>
         <w:pStyle w:val="Heading1"/>
       </w:pPr>
-      <w:proofErr w:type="spellStart"/>
-      <w:r>
-        <w:rPr>
-          <w:rFonts w:eastAsia="Arial Unicode MS"/>
-        </w:rPr>
-        <w:t>Supthavee</w:t>
-      </w:r>
-      <w:proofErr w:type="spellEnd"/>
-      <w:r>
-        <w:rPr>
-          <w:rFonts w:eastAsia="Arial Unicode MS"/>
-        </w:rPr>
-        <w:t xml:space="preserve"> ERP - Document Standards (</w:t>
-      </w:r>
-      <w:proofErr w:type="spellStart"/>
+      <w:r>
+        <w:rPr>
+          <w:rFonts w:eastAsia="Arial Unicode MS"/>
+        </w:rPr>
+        <w:t>Supthavee ERP - Document Standards (</w:t>
+      </w:r>
       <w:r>
         <w:rPr>
           <w:rFonts w:ascii="Browallia New" w:eastAsia="Arial Unicode MS" w:hAnsi="Browallia New" w:cs="Browallia New"/>
         </w:rPr>
         <w:t>มาตรฐานเอกสารอ้างอิงตาม</w:t>
       </w:r>
-      <w:proofErr w:type="spellEnd"/>
       <w:r>
         <w:rPr>
           <w:rFonts w:eastAsia="Arial Unicode MS"/>
@@ -46,14 +36,12 @@
         </w:rPr>
         <w:t xml:space="preserve">1. </w:t>
       </w:r>
-      <w:proofErr w:type="spellStart"/>
       <w:r>
         <w:rPr>
           <w:rFonts w:ascii="Browallia New" w:eastAsia="Arial Unicode MS" w:hAnsi="Browallia New" w:cs="Browallia New"/>
         </w:rPr>
         <w:t>โครงสร้างรหัสเอกสาร</w:t>
       </w:r>
-      <w:proofErr w:type="spellEnd"/>
       <w:r>
         <w:rPr>
           <w:rFonts w:eastAsia="Arial Unicode MS"/>
@@ -72,56 +60,48 @@
         </w:pBdr>
         <w:spacing w:after="240"/>
       </w:pPr>
-      <w:proofErr w:type="spellStart"/>
       <w:r>
         <w:rPr>
           <w:rFonts w:ascii="Browallia New" w:eastAsia="Arial Unicode MS" w:hAnsi="Browallia New" w:cs="Browallia New"/>
         </w:rPr>
         <w:t>รหัสเอกสารในระบบถูกออกแบบมาเพื่อแยกแยะประเภทเอกสาร</w:t>
       </w:r>
-      <w:proofErr w:type="spellEnd"/>
-      <w:r>
-        <w:rPr>
-          <w:rFonts w:eastAsia="Arial Unicode MS"/>
-        </w:rPr>
-        <w:t xml:space="preserve"> </w:t>
-      </w:r>
-      <w:proofErr w:type="spellStart"/>
+      <w:r>
+        <w:rPr>
+          <w:rFonts w:eastAsia="Arial Unicode MS"/>
+        </w:rPr>
+        <w:t xml:space="preserve"> </w:t>
+      </w:r>
       <w:r>
         <w:rPr>
           <w:rFonts w:ascii="Browallia New" w:eastAsia="Arial Unicode MS" w:hAnsi="Browallia New" w:cs="Browallia New"/>
         </w:rPr>
         <w:t>และวัตถุประสงค์ในการลงบัญชีอย่างชัดเจน</w:t>
       </w:r>
-      <w:proofErr w:type="spellEnd"/>
-      <w:r>
-        <w:rPr>
-          <w:rFonts w:eastAsia="Arial Unicode MS"/>
-        </w:rPr>
-        <w:t xml:space="preserve"> </w:t>
-      </w:r>
-      <w:proofErr w:type="spellStart"/>
+      <w:r>
+        <w:rPr>
+          <w:rFonts w:eastAsia="Arial Unicode MS"/>
+        </w:rPr>
+        <w:t xml:space="preserve"> </w:t>
+      </w:r>
       <w:r>
         <w:rPr>
           <w:rFonts w:ascii="Browallia New" w:eastAsia="Arial Unicode MS" w:hAnsi="Browallia New" w:cs="Browallia New"/>
         </w:rPr>
         <w:t>ห้ามนำมาปะปนกันเด็ดขาด</w:t>
       </w:r>
-      <w:proofErr w:type="spellEnd"/>
     </w:p>
     <w:p>
       <w:pPr>
         <w:pStyle w:val="Heading3"/>
         <w:spacing w:before="0"/>
       </w:pPr>
-      <w:proofErr w:type="spellStart"/>
       <w:r>
         <w:rPr>
           <w:rFonts w:ascii="Browallia New" w:eastAsia="Arial Unicode MS" w:hAnsi="Browallia New" w:cs="Browallia New"/>
         </w:rPr>
         <w:t>กลุ่มงานขายและลูกหนี้</w:t>
       </w:r>
-      <w:proofErr w:type="spellEnd"/>
       <w:r>
         <w:rPr>
           <w:rFonts w:eastAsia="Arial Unicode MS"/>
@@ -151,7 +131,6 @@
         </w:rPr>
         <w:t xml:space="preserve">QT (Quotation - </w:t>
       </w:r>
-      <w:proofErr w:type="spellStart"/>
       <w:r>
         <w:rPr>
           <w:rFonts w:ascii="Browallia New" w:eastAsia="Arial Unicode MS" w:hAnsi="Browallia New" w:cs="Browallia New"/>
@@ -160,7 +139,6 @@
         </w:rPr>
         <w:t>ใบเสนอราคา</w:t>
       </w:r>
-      <w:proofErr w:type="spellEnd"/>
       <w:r>
         <w:rPr>
           <w:rFonts w:eastAsia="Arial Unicode MS"/>
@@ -175,28 +153,24 @@
         </w:rPr>
         <w:t xml:space="preserve"> </w:t>
       </w:r>
-      <w:proofErr w:type="spellStart"/>
       <w:r>
         <w:rPr>
           <w:rFonts w:ascii="Browallia New" w:eastAsia="Arial Unicode MS" w:hAnsi="Browallia New" w:cs="Browallia New"/>
         </w:rPr>
         <w:t>เอกสารเริ่มต้นกระบวนการขาย</w:t>
       </w:r>
-      <w:proofErr w:type="spellEnd"/>
-      <w:r>
-        <w:rPr>
-          <w:rFonts w:eastAsia="Arial Unicode MS"/>
-        </w:rPr>
-        <w:t xml:space="preserve"> </w:t>
-      </w:r>
-      <w:proofErr w:type="spellStart"/>
+      <w:r>
+        <w:rPr>
+          <w:rFonts w:eastAsia="Arial Unicode MS"/>
+        </w:rPr>
+        <w:t xml:space="preserve"> </w:t>
+      </w:r>
       <w:r>
         <w:rPr>
           <w:rFonts w:ascii="Browallia New" w:eastAsia="Arial Unicode MS" w:hAnsi="Browallia New" w:cs="Browallia New"/>
         </w:rPr>
         <w:t>ไม่มีผลต่อสต็อกและการเงิน</w:t>
       </w:r>
-      <w:proofErr w:type="spellEnd"/>
     </w:p>
     <w:p>
       <w:pPr>
@@ -569,7 +543,6 @@
         </w:rPr>
         <w:t xml:space="preserve">INV_DO (Invoice/Delivery Order - </w:t>
       </w:r>
-      <w:proofErr w:type="spellStart"/>
       <w:r>
         <w:rPr>
           <w:rFonts w:ascii="Browallia New" w:eastAsia="Arial Unicode MS" w:hAnsi="Browallia New" w:cs="Browallia New"/>
@@ -578,7 +551,6 @@
         </w:rPr>
         <w:t>ใบกำกับสินค้า</w:t>
       </w:r>
-      <w:proofErr w:type="spellEnd"/>
       <w:r>
         <w:rPr>
           <w:rFonts w:eastAsia="Arial Unicode MS"/>
@@ -587,7 +559,6 @@
         </w:rPr>
         <w:t>/</w:t>
       </w:r>
-      <w:proofErr w:type="spellStart"/>
       <w:r>
         <w:rPr>
           <w:rFonts w:ascii="Browallia New" w:eastAsia="Arial Unicode MS" w:hAnsi="Browallia New" w:cs="Browallia New"/>
@@ -596,7 +567,6 @@
         </w:rPr>
         <w:t>ใบส่งของ</w:t>
       </w:r>
-      <w:proofErr w:type="spellEnd"/>
       <w:r>
         <w:rPr>
           <w:rFonts w:eastAsia="Arial Unicode MS"/>
@@ -611,42 +581,36 @@
         </w:rPr>
         <w:t xml:space="preserve"> </w:t>
       </w:r>
-      <w:proofErr w:type="spellStart"/>
       <w:r>
         <w:rPr>
           <w:rFonts w:ascii="Browallia New" w:eastAsia="Arial Unicode MS" w:hAnsi="Browallia New" w:cs="Browallia New"/>
         </w:rPr>
         <w:t>บิลขายทั่วไป</w:t>
       </w:r>
-      <w:proofErr w:type="spellEnd"/>
       <w:r>
         <w:rPr>
           <w:rFonts w:eastAsia="Arial Unicode MS"/>
         </w:rPr>
         <w:t xml:space="preserve"> (</w:t>
       </w:r>
-      <w:proofErr w:type="spellStart"/>
       <w:r>
         <w:rPr>
           <w:rFonts w:ascii="Browallia New" w:eastAsia="Arial Unicode MS" w:hAnsi="Browallia New" w:cs="Browallia New"/>
         </w:rPr>
         <w:t>ไม่มี</w:t>
       </w:r>
-      <w:proofErr w:type="spellEnd"/>
       <w:r>
         <w:rPr>
           <w:rFonts w:eastAsia="Arial Unicode MS"/>
         </w:rPr>
         <w:t xml:space="preserve"> VAT) </w:t>
       </w:r>
-      <w:proofErr w:type="spellStart"/>
       <w:r>
         <w:rPr>
           <w:rFonts w:ascii="Browallia New" w:eastAsia="Arial Unicode MS" w:hAnsi="Browallia New" w:cs="Browallia New"/>
         </w:rPr>
         <w:t>มีผลตัดสต็อกขาออกทันที</w:t>
       </w:r>
-      <w:proofErr w:type="spellEnd"/>
     </w:p>
     <w:p>
       <w:pPr>
@@ -670,7 +634,6 @@
         </w:rPr>
         <w:t xml:space="preserve">TAX_INV (Tax Invoice - </w:t>
       </w:r>
-      <w:proofErr w:type="spellStart"/>
       <w:r>
         <w:rPr>
           <w:rFonts w:ascii="Browallia New" w:eastAsia="Arial Unicode MS" w:hAnsi="Browallia New" w:cs="Browallia New"/>
@@ -679,7 +642,6 @@
         </w:rPr>
         <w:t>ใบกำกับภาษีเต็มรูป</w:t>
       </w:r>
-      <w:proofErr w:type="spellEnd"/>
       <w:r>
         <w:rPr>
           <w:rFonts w:eastAsia="Arial Unicode MS"/>
@@ -694,42 +656,36 @@
         </w:rPr>
         <w:t xml:space="preserve"> </w:t>
       </w:r>
-      <w:proofErr w:type="spellStart"/>
       <w:r>
         <w:rPr>
           <w:rFonts w:ascii="Browallia New" w:eastAsia="Arial Unicode MS" w:hAnsi="Browallia New" w:cs="Browallia New"/>
         </w:rPr>
         <w:t>บิลขายสำหรับบริษัทที่จดทะเบียน</w:t>
       </w:r>
-      <w:proofErr w:type="spellEnd"/>
       <w:r>
         <w:rPr>
           <w:rFonts w:eastAsia="Arial Unicode MS"/>
         </w:rPr>
         <w:t xml:space="preserve"> VAT (</w:t>
       </w:r>
-      <w:proofErr w:type="spellStart"/>
       <w:r>
         <w:rPr>
           <w:rFonts w:ascii="Browallia New" w:eastAsia="Arial Unicode MS" w:hAnsi="Browallia New" w:cs="Browallia New"/>
         </w:rPr>
         <w:t>คำนวณภาษีแบบ</w:t>
       </w:r>
-      <w:proofErr w:type="spellEnd"/>
       <w:r>
         <w:rPr>
           <w:rFonts w:eastAsia="Arial Unicode MS"/>
         </w:rPr>
         <w:t xml:space="preserve"> Exclusive/Inclusive) </w:t>
       </w:r>
-      <w:proofErr w:type="spellStart"/>
       <w:r>
         <w:rPr>
           <w:rFonts w:ascii="Browallia New" w:eastAsia="Arial Unicode MS" w:hAnsi="Browallia New" w:cs="Browallia New"/>
         </w:rPr>
         <w:t>มีผลตัดสต็อกขาออก</w:t>
       </w:r>
-      <w:proofErr w:type="spellEnd"/>
     </w:p>
     <w:p>
       <w:pPr>
@@ -753,7 +709,6 @@
         </w:rPr>
         <w:t xml:space="preserve">CS_TAX (Cash Sale Tax - </w:t>
       </w:r>
-      <w:proofErr w:type="spellStart"/>
       <w:r>
         <w:rPr>
           <w:rFonts w:ascii="Browallia New" w:eastAsia="Arial Unicode MS" w:hAnsi="Browallia New" w:cs="Browallia New"/>
@@ -762,7 +717,6 @@
         </w:rPr>
         <w:t>ใบกำกับภาษีอย่างย่อ</w:t>
       </w:r>
-      <w:proofErr w:type="spellEnd"/>
       <w:r>
         <w:rPr>
           <w:rFonts w:eastAsia="Arial Unicode MS"/>
@@ -777,42 +731,36 @@
         </w:rPr>
         <w:t xml:space="preserve"> </w:t>
       </w:r>
-      <w:proofErr w:type="spellStart"/>
       <w:r>
         <w:rPr>
           <w:rFonts w:ascii="Browallia New" w:eastAsia="Arial Unicode MS" w:hAnsi="Browallia New" w:cs="Browallia New"/>
         </w:rPr>
         <w:t>บิลขายหน้าร้าน</w:t>
       </w:r>
-      <w:proofErr w:type="spellEnd"/>
       <w:r>
         <w:rPr>
           <w:rFonts w:eastAsia="Arial Unicode MS"/>
         </w:rPr>
         <w:t xml:space="preserve"> (ABB) </w:t>
       </w:r>
-      <w:proofErr w:type="spellStart"/>
       <w:r>
         <w:rPr>
           <w:rFonts w:ascii="Browallia New" w:eastAsia="Arial Unicode MS" w:hAnsi="Browallia New" w:cs="Browallia New"/>
         </w:rPr>
         <w:t>สำหรับลูกค้าทั่วไป</w:t>
       </w:r>
-      <w:proofErr w:type="spellEnd"/>
-      <w:r>
-        <w:rPr>
-          <w:rFonts w:eastAsia="Arial Unicode MS"/>
-        </w:rPr>
-        <w:t xml:space="preserve"> </w:t>
-      </w:r>
-      <w:proofErr w:type="spellStart"/>
+      <w:r>
+        <w:rPr>
+          <w:rFonts w:eastAsia="Arial Unicode MS"/>
+        </w:rPr>
+        <w:t xml:space="preserve"> </w:t>
+      </w:r>
       <w:r>
         <w:rPr>
           <w:rFonts w:ascii="Browallia New" w:eastAsia="Arial Unicode MS" w:hAnsi="Browallia New" w:cs="Browallia New"/>
         </w:rPr>
         <w:t>มีผลตัดสต็อกขาออก</w:t>
       </w:r>
-      <w:proofErr w:type="spellEnd"/>
     </w:p>
     <w:p>
       <w:pPr>
@@ -836,7 +784,6 @@
         </w:rPr>
         <w:t xml:space="preserve">ABB (Abbreviated Tax Invoice - </w:t>
       </w:r>
-      <w:proofErr w:type="spellStart"/>
       <w:r>
         <w:rPr>
           <w:rFonts w:ascii="Browallia New" w:eastAsia="Arial Unicode MS" w:hAnsi="Browallia New" w:cs="Browallia New"/>
@@ -845,7 +792,6 @@
         </w:rPr>
         <w:t>ใบเสร็จรับเงินอย่างย่อ</w:t>
       </w:r>
-      <w:proofErr w:type="spellEnd"/>
       <w:r>
         <w:rPr>
           <w:rFonts w:eastAsia="Arial Unicode MS"/>
@@ -860,14 +806,12 @@
         </w:rPr>
         <w:t xml:space="preserve"> </w:t>
       </w:r>
-      <w:proofErr w:type="spellStart"/>
       <w:r>
         <w:rPr>
           <w:rFonts w:ascii="Browallia New" w:eastAsia="Arial Unicode MS" w:hAnsi="Browallia New" w:cs="Browallia New"/>
         </w:rPr>
         <w:t>ใบเสร็จรับเงินสำหรับขายหน้าร้าน</w:t>
       </w:r>
-      <w:proofErr w:type="spellEnd"/>
     </w:p>
     <w:p>
       <w:pPr>
@@ -891,7 +835,6 @@
         </w:rPr>
         <w:t xml:space="preserve">BN (Billing Note - </w:t>
       </w:r>
-      <w:proofErr w:type="spellStart"/>
       <w:r>
         <w:rPr>
           <w:rFonts w:ascii="Browallia New" w:eastAsia="Arial Unicode MS" w:hAnsi="Browallia New" w:cs="Browallia New"/>
@@ -900,7 +843,6 @@
         </w:rPr>
         <w:t>ใบวางบิลลูกหนี้</w:t>
       </w:r>
-      <w:proofErr w:type="spellEnd"/>
       <w:r>
         <w:rPr>
           <w:rFonts w:eastAsia="Arial Unicode MS"/>
@@ -915,56 +857,48 @@
         </w:rPr>
         <w:t xml:space="preserve"> </w:t>
       </w:r>
-      <w:proofErr w:type="spellStart"/>
       <w:r>
         <w:rPr>
           <w:rFonts w:ascii="Browallia New" w:eastAsia="Arial Unicode MS" w:hAnsi="Browallia New" w:cs="Browallia New"/>
         </w:rPr>
         <w:t>เอกสารรวบรวมบิลขายหลายใบเพื่อเรียกเก็บเงิน</w:t>
       </w:r>
-      <w:proofErr w:type="spellEnd"/>
-      <w:r>
-        <w:rPr>
-          <w:rFonts w:eastAsia="Arial Unicode MS"/>
-        </w:rPr>
-        <w:t xml:space="preserve"> </w:t>
-      </w:r>
-      <w:proofErr w:type="spellStart"/>
+      <w:r>
+        <w:rPr>
+          <w:rFonts w:eastAsia="Arial Unicode MS"/>
+        </w:rPr>
+        <w:t xml:space="preserve"> </w:t>
+      </w:r>
       <w:r>
         <w:rPr>
           <w:rFonts w:ascii="Browallia New" w:eastAsia="Arial Unicode MS" w:hAnsi="Browallia New" w:cs="Browallia New"/>
         </w:rPr>
         <w:t>ไม่มีผลต่อ</w:t>
       </w:r>
-      <w:proofErr w:type="spellEnd"/>
       <w:r>
         <w:rPr>
           <w:rFonts w:eastAsia="Arial Unicode MS"/>
         </w:rPr>
         <w:t xml:space="preserve"> GL (</w:t>
       </w:r>
-      <w:proofErr w:type="spellStart"/>
       <w:r>
         <w:rPr>
           <w:rFonts w:ascii="Browallia New" w:eastAsia="Arial Unicode MS" w:hAnsi="Browallia New" w:cs="Browallia New"/>
         </w:rPr>
         <w:t>ใช้สำหรับการทำ</w:t>
       </w:r>
-      <w:proofErr w:type="spellEnd"/>
       <w:r>
         <w:rPr>
           <w:rFonts w:eastAsia="Arial Unicode MS"/>
         </w:rPr>
         <w:t xml:space="preserve"> Knock-off Allocation </w:t>
       </w:r>
-      <w:proofErr w:type="spellStart"/>
       <w:r>
         <w:rPr>
           <w:rFonts w:ascii="Browallia New" w:eastAsia="Arial Unicode MS" w:hAnsi="Browallia New" w:cs="Browallia New"/>
         </w:rPr>
         <w:t>ได้ง่ายขึ้น</w:t>
       </w:r>
-      <w:proofErr w:type="spellEnd"/>
       <w:r>
         <w:rPr>
           <w:rFonts w:eastAsia="Arial Unicode MS"/>
@@ -994,7 +928,6 @@
         </w:rPr>
         <w:t xml:space="preserve">REC (Receipt - </w:t>
       </w:r>
-      <w:proofErr w:type="spellStart"/>
       <w:r>
         <w:rPr>
           <w:rFonts w:ascii="Browallia New" w:eastAsia="Arial Unicode MS" w:hAnsi="Browallia New" w:cs="Browallia New"/>
@@ -1003,7 +936,6 @@
         </w:rPr>
         <w:t>ใบเสร็จรับเงิน</w:t>
       </w:r>
-      <w:proofErr w:type="spellEnd"/>
       <w:r>
         <w:rPr>
           <w:rFonts w:eastAsia="Arial Unicode MS"/>
@@ -1018,42 +950,36 @@
         </w:rPr>
         <w:t xml:space="preserve"> </w:t>
       </w:r>
-      <w:proofErr w:type="spellStart"/>
       <w:r>
         <w:rPr>
           <w:rFonts w:ascii="Browallia New" w:eastAsia="Arial Unicode MS" w:hAnsi="Browallia New" w:cs="Browallia New"/>
         </w:rPr>
         <w:t>บันทึกรับชำระหนี้จากลูกหนี้</w:t>
       </w:r>
-      <w:proofErr w:type="spellEnd"/>
-      <w:r>
-        <w:rPr>
-          <w:rFonts w:eastAsia="Arial Unicode MS"/>
-        </w:rPr>
-        <w:t xml:space="preserve"> </w:t>
-      </w:r>
-      <w:proofErr w:type="spellStart"/>
+      <w:r>
+        <w:rPr>
+          <w:rFonts w:eastAsia="Arial Unicode MS"/>
+        </w:rPr>
+        <w:t xml:space="preserve"> </w:t>
+      </w:r>
       <w:r>
         <w:rPr>
           <w:rFonts w:ascii="Browallia New" w:eastAsia="Arial Unicode MS" w:hAnsi="Browallia New" w:cs="Browallia New"/>
         </w:rPr>
         <w:t>หรือรับเงินสด</w:t>
       </w:r>
-      <w:proofErr w:type="spellEnd"/>
       <w:r>
         <w:rPr>
           <w:rFonts w:eastAsia="Arial Unicode MS"/>
         </w:rPr>
         <w:t xml:space="preserve"> (</w:t>
       </w:r>
-      <w:proofErr w:type="spellStart"/>
       <w:r>
         <w:rPr>
           <w:rFonts w:ascii="Browallia New" w:eastAsia="Arial Unicode MS" w:hAnsi="Browallia New" w:cs="Browallia New"/>
         </w:rPr>
         <w:t>ตัดจาก</w:t>
       </w:r>
-      <w:proofErr w:type="spellEnd"/>
       <w:r>
         <w:rPr>
           <w:rFonts w:eastAsia="Arial Unicode MS"/>
@@ -1083,7 +1009,6 @@
         </w:rPr>
         <w:t xml:space="preserve">DEP_IN (Deposit In - </w:t>
       </w:r>
-      <w:proofErr w:type="spellStart"/>
       <w:r>
         <w:rPr>
           <w:rFonts w:ascii="Browallia New" w:eastAsia="Arial Unicode MS" w:hAnsi="Browallia New" w:cs="Browallia New"/>
@@ -1092,7 +1017,6 @@
         </w:rPr>
         <w:t>ใบรับเงินมัดจำ</w:t>
       </w:r>
-      <w:proofErr w:type="spellEnd"/>
       <w:r>
         <w:rPr>
           <w:rFonts w:eastAsia="Arial Unicode MS"/>
@@ -1107,56 +1031,48 @@
         </w:rPr>
         <w:t xml:space="preserve"> </w:t>
       </w:r>
-      <w:proofErr w:type="spellStart"/>
       <w:r>
         <w:rPr>
           <w:rFonts w:ascii="Browallia New" w:eastAsia="Arial Unicode MS" w:hAnsi="Browallia New" w:cs="Browallia New"/>
         </w:rPr>
         <w:t>บันทึกรับเงินมัดจำจากลูกค้า</w:t>
       </w:r>
-      <w:proofErr w:type="spellEnd"/>
-      <w:r>
-        <w:rPr>
-          <w:rFonts w:eastAsia="Arial Unicode MS"/>
-        </w:rPr>
-        <w:t xml:space="preserve"> </w:t>
-      </w:r>
-      <w:proofErr w:type="spellStart"/>
+      <w:r>
+        <w:rPr>
+          <w:rFonts w:eastAsia="Arial Unicode MS"/>
+        </w:rPr>
+        <w:t xml:space="preserve"> </w:t>
+      </w:r>
       <w:r>
         <w:rPr>
           <w:rFonts w:ascii="Browallia New" w:eastAsia="Arial Unicode MS" w:hAnsi="Browallia New" w:cs="Browallia New"/>
         </w:rPr>
         <w:t>สามารถนำยอดไปหักเป็นส่วนลดในใบ</w:t>
       </w:r>
-      <w:proofErr w:type="spellEnd"/>
       <w:r>
         <w:rPr>
           <w:rFonts w:eastAsia="Arial Unicode MS"/>
         </w:rPr>
         <w:t xml:space="preserve"> REC </w:t>
       </w:r>
-      <w:proofErr w:type="spellStart"/>
       <w:r>
         <w:rPr>
           <w:rFonts w:ascii="Browallia New" w:eastAsia="Arial Unicode MS" w:hAnsi="Browallia New" w:cs="Browallia New"/>
         </w:rPr>
         <w:t>ได้</w:t>
       </w:r>
-      <w:proofErr w:type="spellEnd"/>
       <w:r>
         <w:rPr>
           <w:rFonts w:eastAsia="Arial Unicode MS"/>
         </w:rPr>
         <w:t xml:space="preserve"> (</w:t>
       </w:r>
-      <w:proofErr w:type="spellStart"/>
       <w:r>
         <w:rPr>
           <w:rFonts w:ascii="Browallia New" w:eastAsia="Arial Unicode MS" w:hAnsi="Browallia New" w:cs="Browallia New"/>
         </w:rPr>
         <w:t>ตัดมัดจำ</w:t>
       </w:r>
-      <w:proofErr w:type="spellEnd"/>
       <w:r>
         <w:rPr>
           <w:rFonts w:eastAsia="Arial Unicode MS"/>
@@ -1186,7 +1102,6 @@
         </w:rPr>
         <w:t xml:space="preserve">AR_REFUND (SRF - Sales Refund - </w:t>
       </w:r>
-      <w:proofErr w:type="spellStart"/>
       <w:r>
         <w:rPr>
           <w:rFonts w:ascii="Browallia New" w:eastAsia="Arial Unicode MS" w:hAnsi="Browallia New" w:cs="Browallia New"/>
@@ -1195,7 +1110,6 @@
         </w:rPr>
         <w:t>ใบสำคัญจ่ายเงินคืน</w:t>
       </w:r>
-      <w:proofErr w:type="spellEnd"/>
       <w:r>
         <w:rPr>
           <w:rFonts w:eastAsia="Arial Unicode MS"/>
@@ -1210,42 +1124,36 @@
         </w:rPr>
         <w:t xml:space="preserve"> </w:t>
       </w:r>
-      <w:proofErr w:type="spellStart"/>
       <w:r>
         <w:rPr>
           <w:rFonts w:ascii="Browallia New" w:eastAsia="Arial Unicode MS" w:hAnsi="Browallia New" w:cs="Browallia New"/>
         </w:rPr>
         <w:t>บันทึกการจ่ายเงินคืนให้ลูกค้า</w:t>
       </w:r>
-      <w:proofErr w:type="spellEnd"/>
       <w:r>
         <w:rPr>
           <w:rFonts w:eastAsia="Arial Unicode MS"/>
         </w:rPr>
         <w:t xml:space="preserve"> (</w:t>
       </w:r>
-      <w:proofErr w:type="spellStart"/>
       <w:r>
         <w:rPr>
           <w:rFonts w:ascii="Browallia New" w:eastAsia="Arial Unicode MS" w:hAnsi="Browallia New" w:cs="Browallia New"/>
         </w:rPr>
         <w:t>เช่น</w:t>
       </w:r>
-      <w:proofErr w:type="spellEnd"/>
-      <w:r>
-        <w:rPr>
-          <w:rFonts w:eastAsia="Arial Unicode MS"/>
-        </w:rPr>
-        <w:t xml:space="preserve"> </w:t>
-      </w:r>
-      <w:proofErr w:type="spellStart"/>
+      <w:r>
+        <w:rPr>
+          <w:rFonts w:eastAsia="Arial Unicode MS"/>
+        </w:rPr>
+        <w:t xml:space="preserve"> </w:t>
+      </w:r>
       <w:r>
         <w:rPr>
           <w:rFonts w:ascii="Browallia New" w:eastAsia="Arial Unicode MS" w:hAnsi="Browallia New" w:cs="Browallia New"/>
         </w:rPr>
         <w:t>คืนมัดจำ</w:t>
       </w:r>
-      <w:proofErr w:type="spellEnd"/>
       <w:r>
         <w:rPr>
           <w:rFonts w:eastAsia="Arial Unicode MS"/>
@@ -1275,7 +1183,6 @@
         </w:rPr>
         <w:t xml:space="preserve">AR_WRITEOFF (SWO - Sales Write-off - </w:t>
       </w:r>
-      <w:proofErr w:type="spellStart"/>
       <w:r>
         <w:rPr>
           <w:rFonts w:ascii="Browallia New" w:eastAsia="Arial Unicode MS" w:hAnsi="Browallia New" w:cs="Browallia New"/>
@@ -1284,7 +1191,6 @@
         </w:rPr>
         <w:t>ใบสำคัญตัดหนี้สูญ</w:t>
       </w:r>
-      <w:proofErr w:type="spellEnd"/>
       <w:r>
         <w:rPr>
           <w:rFonts w:eastAsia="Arial Unicode MS"/>
@@ -1299,28 +1205,24 @@
         </w:rPr>
         <w:t xml:space="preserve"> </w:t>
       </w:r>
-      <w:proofErr w:type="spellStart"/>
       <w:r>
         <w:rPr>
           <w:rFonts w:ascii="Browallia New" w:eastAsia="Arial Unicode MS" w:hAnsi="Browallia New" w:cs="Browallia New"/>
         </w:rPr>
         <w:t>บันทึกการตัดยอดหนี้ที่เก็บไม่ได้</w:t>
       </w:r>
-      <w:proofErr w:type="spellEnd"/>
-      <w:r>
-        <w:rPr>
-          <w:rFonts w:eastAsia="Arial Unicode MS"/>
-        </w:rPr>
-        <w:t xml:space="preserve"> </w:t>
-      </w:r>
-      <w:proofErr w:type="spellStart"/>
+      <w:r>
+        <w:rPr>
+          <w:rFonts w:eastAsia="Arial Unicode MS"/>
+        </w:rPr>
+        <w:t xml:space="preserve"> </w:t>
+      </w:r>
       <w:r>
         <w:rPr>
           <w:rFonts w:ascii="Browallia New" w:eastAsia="Arial Unicode MS" w:hAnsi="Browallia New" w:cs="Browallia New"/>
         </w:rPr>
         <w:t>หรือตัดเศษบัญชีลูกหนี้</w:t>
       </w:r>
-      <w:proofErr w:type="spellEnd"/>
     </w:p>
     <w:p>
       <w:pPr>
@@ -1949,7 +1851,6 @@
       <w:pPr>
         <w:pStyle w:val="Heading3"/>
       </w:pPr>
-      <w:proofErr w:type="spellStart"/>
       <w:r>
         <w:rPr>
           <w:rFonts w:ascii="Browallia New" w:eastAsia="Arial Unicode MS" w:hAnsi="Browallia New" w:cs="Browallia New"/>
@@ -1957,7 +1858,6 @@
         <w:lastRenderedPageBreak/>
         <w:t>กลุ่มงานจัดซื้อและเจ้าหนี้</w:t>
       </w:r>
-      <w:proofErr w:type="spellEnd"/>
       <w:r>
         <w:rPr>
           <w:rFonts w:eastAsia="Arial Unicode MS"/>
@@ -1987,7 +1887,6 @@
         </w:rPr>
         <w:t xml:space="preserve">PO (Purchase Order - </w:t>
       </w:r>
-      <w:proofErr w:type="spellStart"/>
       <w:r>
         <w:rPr>
           <w:rFonts w:ascii="Browallia New" w:eastAsia="Arial Unicode MS" w:hAnsi="Browallia New" w:cs="Browallia New"/>
@@ -1996,7 +1895,6 @@
         </w:rPr>
         <w:t>ใบสั่งซื้อ</w:t>
       </w:r>
-      <w:proofErr w:type="spellEnd"/>
       <w:r>
         <w:rPr>
           <w:rFonts w:eastAsia="Arial Unicode MS"/>
@@ -2011,28 +1909,24 @@
         </w:rPr>
         <w:t xml:space="preserve"> </w:t>
       </w:r>
-      <w:proofErr w:type="spellStart"/>
       <w:r>
         <w:rPr>
           <w:rFonts w:ascii="Browallia New" w:eastAsia="Arial Unicode MS" w:hAnsi="Browallia New" w:cs="Browallia New"/>
         </w:rPr>
         <w:t>เอกสารเริ่มต้นกระบวนการซื้อ</w:t>
       </w:r>
-      <w:proofErr w:type="spellEnd"/>
-      <w:r>
-        <w:rPr>
-          <w:rFonts w:eastAsia="Arial Unicode MS"/>
-        </w:rPr>
-        <w:t xml:space="preserve"> </w:t>
-      </w:r>
-      <w:proofErr w:type="spellStart"/>
+      <w:r>
+        <w:rPr>
+          <w:rFonts w:eastAsia="Arial Unicode MS"/>
+        </w:rPr>
+        <w:t xml:space="preserve"> </w:t>
+      </w:r>
       <w:r>
         <w:rPr>
           <w:rFonts w:ascii="Browallia New" w:eastAsia="Arial Unicode MS" w:hAnsi="Browallia New" w:cs="Browallia New"/>
         </w:rPr>
         <w:t>ไม่มีผลต่อสต็อกและการเงิน</w:t>
       </w:r>
-      <w:proofErr w:type="spellEnd"/>
     </w:p>
     <w:p>
       <w:pPr>
@@ -2056,7 +1950,6 @@
         </w:rPr>
         <w:t xml:space="preserve">AP_CASH (Cash Purchase - </w:t>
       </w:r>
-      <w:proofErr w:type="spellStart"/>
       <w:r>
         <w:rPr>
           <w:rFonts w:ascii="Browallia New" w:eastAsia="Arial Unicode MS" w:hAnsi="Browallia New" w:cs="Browallia New"/>
@@ -2065,7 +1958,6 @@
         </w:rPr>
         <w:t>ซื้อเงินสด</w:t>
       </w:r>
-      <w:proofErr w:type="spellEnd"/>
       <w:r>
         <w:rPr>
           <w:rFonts w:eastAsia="Arial Unicode MS"/>
@@ -2080,56 +1972,48 @@
         </w:rPr>
         <w:t xml:space="preserve"> </w:t>
       </w:r>
-      <w:proofErr w:type="spellStart"/>
       <w:r>
         <w:rPr>
           <w:rFonts w:ascii="Browallia New" w:eastAsia="Arial Unicode MS" w:hAnsi="Browallia New" w:cs="Browallia New"/>
         </w:rPr>
         <w:t>บันทึกบิลซื้อที่ชำระเงินทันที</w:t>
       </w:r>
-      <w:proofErr w:type="spellEnd"/>
-      <w:r>
-        <w:rPr>
-          <w:rFonts w:eastAsia="Arial Unicode MS"/>
-        </w:rPr>
-        <w:t xml:space="preserve"> </w:t>
-      </w:r>
-      <w:proofErr w:type="spellStart"/>
+      <w:r>
+        <w:rPr>
+          <w:rFonts w:eastAsia="Arial Unicode MS"/>
+        </w:rPr>
+        <w:t xml:space="preserve"> </w:t>
+      </w:r>
       <w:r>
         <w:rPr>
           <w:rFonts w:ascii="Browallia New" w:eastAsia="Arial Unicode MS" w:hAnsi="Browallia New" w:cs="Browallia New"/>
         </w:rPr>
         <w:t>มีผลรับสต็อกเข้า</w:t>
       </w:r>
-      <w:proofErr w:type="spellEnd"/>
-      <w:r>
-        <w:rPr>
-          <w:rFonts w:eastAsia="Arial Unicode MS"/>
-        </w:rPr>
-        <w:t xml:space="preserve"> </w:t>
-      </w:r>
-      <w:proofErr w:type="spellStart"/>
+      <w:r>
+        <w:rPr>
+          <w:rFonts w:eastAsia="Arial Unicode MS"/>
+        </w:rPr>
+        <w:t xml:space="preserve"> </w:t>
+      </w:r>
       <w:r>
         <w:rPr>
           <w:rFonts w:ascii="Browallia New" w:eastAsia="Arial Unicode MS" w:hAnsi="Browallia New" w:cs="Browallia New"/>
         </w:rPr>
         <w:t>ระบบจะเปลี่ยนสถานะเป็น</w:t>
       </w:r>
-      <w:proofErr w:type="spellEnd"/>
       <w:r>
         <w:rPr>
           <w:rFonts w:eastAsia="Arial Unicode MS"/>
         </w:rPr>
         <w:t xml:space="preserve"> PAID </w:t>
       </w:r>
-      <w:proofErr w:type="spellStart"/>
       <w:r>
         <w:rPr>
           <w:rFonts w:ascii="Browallia New" w:eastAsia="Arial Unicode MS" w:hAnsi="Browallia New" w:cs="Browallia New"/>
         </w:rPr>
         <w:t>อัตโนมัติเมื่ออนุมัติ</w:t>
       </w:r>
-      <w:proofErr w:type="spellEnd"/>
       <w:r>
         <w:rPr>
           <w:rFonts w:eastAsia="Arial Unicode MS"/>
@@ -2159,7 +2043,6 @@
         </w:rPr>
         <w:t xml:space="preserve">AP_INV (AP Invoice - </w:t>
       </w:r>
-      <w:proofErr w:type="spellStart"/>
       <w:r>
         <w:rPr>
           <w:rFonts w:ascii="Browallia New" w:eastAsia="Arial Unicode MS" w:hAnsi="Browallia New" w:cs="Browallia New"/>
@@ -2168,7 +2051,6 @@
         </w:rPr>
         <w:t>ตั้งเจ้าหนี้การค้า</w:t>
       </w:r>
-      <w:proofErr w:type="spellEnd"/>
       <w:r>
         <w:rPr>
           <w:rFonts w:eastAsia="Arial Unicode MS"/>
@@ -2183,42 +2065,36 @@
         </w:rPr>
         <w:t xml:space="preserve"> </w:t>
       </w:r>
-      <w:proofErr w:type="spellStart"/>
       <w:r>
         <w:rPr>
           <w:rFonts w:ascii="Browallia New" w:eastAsia="Arial Unicode MS" w:hAnsi="Browallia New" w:cs="Browallia New"/>
         </w:rPr>
         <w:t>บันทึกบิลซื้อแบบเครดิต</w:t>
       </w:r>
-      <w:proofErr w:type="spellEnd"/>
-      <w:r>
-        <w:rPr>
-          <w:rFonts w:eastAsia="Arial Unicode MS"/>
-        </w:rPr>
-        <w:t xml:space="preserve"> </w:t>
-      </w:r>
-      <w:proofErr w:type="spellStart"/>
+      <w:r>
+        <w:rPr>
+          <w:rFonts w:eastAsia="Arial Unicode MS"/>
+        </w:rPr>
+        <w:t xml:space="preserve"> </w:t>
+      </w:r>
       <w:r>
         <w:rPr>
           <w:rFonts w:ascii="Browallia New" w:eastAsia="Arial Unicode MS" w:hAnsi="Browallia New" w:cs="Browallia New"/>
         </w:rPr>
         <w:t>มีผลรับสต็อกเข้า</w:t>
       </w:r>
-      <w:proofErr w:type="spellEnd"/>
-      <w:r>
-        <w:rPr>
-          <w:rFonts w:eastAsia="Arial Unicode MS"/>
-        </w:rPr>
-        <w:t xml:space="preserve"> </w:t>
-      </w:r>
-      <w:proofErr w:type="spellStart"/>
+      <w:r>
+        <w:rPr>
+          <w:rFonts w:eastAsia="Arial Unicode MS"/>
+        </w:rPr>
+        <w:t xml:space="preserve"> </w:t>
+      </w:r>
       <w:r>
         <w:rPr>
           <w:rFonts w:ascii="Browallia New" w:eastAsia="Arial Unicode MS" w:hAnsi="Browallia New" w:cs="Browallia New"/>
         </w:rPr>
         <w:t>รอการชำระเงิน</w:t>
       </w:r>
-      <w:proofErr w:type="spellEnd"/>
     </w:p>
     <w:p>
       <w:pPr>
@@ -2242,7 +2118,6 @@
         </w:rPr>
         <w:t xml:space="preserve">AP_TAX (AP Tax Invoice - </w:t>
       </w:r>
-      <w:proofErr w:type="spellStart"/>
       <w:r>
         <w:rPr>
           <w:rFonts w:ascii="Browallia New" w:eastAsia="Arial Unicode MS" w:hAnsi="Browallia New" w:cs="Browallia New"/>
@@ -2251,7 +2126,6 @@
         </w:rPr>
         <w:t>ตั้งเจ้าหนี้และภาษีซื้อ</w:t>
       </w:r>
-      <w:proofErr w:type="spellEnd"/>
       <w:r>
         <w:rPr>
           <w:rFonts w:eastAsia="Arial Unicode MS"/>
@@ -2266,42 +2140,36 @@
         </w:rPr>
         <w:t xml:space="preserve"> </w:t>
       </w:r>
-      <w:proofErr w:type="spellStart"/>
       <w:r>
         <w:rPr>
           <w:rFonts w:ascii="Browallia New" w:eastAsia="Arial Unicode MS" w:hAnsi="Browallia New" w:cs="Browallia New"/>
         </w:rPr>
         <w:t>บันทึกบิลซื้อแบบเครดิตที่มี</w:t>
       </w:r>
-      <w:proofErr w:type="spellEnd"/>
       <w:r>
         <w:rPr>
           <w:rFonts w:eastAsia="Arial Unicode MS"/>
         </w:rPr>
         <w:t xml:space="preserve"> VAT (</w:t>
       </w:r>
-      <w:proofErr w:type="spellStart"/>
       <w:r>
         <w:rPr>
           <w:rFonts w:ascii="Browallia New" w:eastAsia="Arial Unicode MS" w:hAnsi="Browallia New" w:cs="Browallia New"/>
         </w:rPr>
         <w:t>ขอคืนภาษีได้</w:t>
       </w:r>
-      <w:proofErr w:type="spellEnd"/>
       <w:r>
         <w:rPr>
           <w:rFonts w:eastAsia="Arial Unicode MS"/>
         </w:rPr>
         <w:t xml:space="preserve">) </w:t>
       </w:r>
-      <w:proofErr w:type="spellStart"/>
       <w:r>
         <w:rPr>
           <w:rFonts w:ascii="Browallia New" w:eastAsia="Arial Unicode MS" w:hAnsi="Browallia New" w:cs="Browallia New"/>
         </w:rPr>
         <w:t>มีผลรับสต็อกเข้า</w:t>
       </w:r>
-      <w:proofErr w:type="spellEnd"/>
     </w:p>
     <w:p>
       <w:pPr>
@@ -2325,7 +2193,6 @@
         </w:rPr>
         <w:t xml:space="preserve">BR (Bill Receipt - </w:t>
       </w:r>
-      <w:proofErr w:type="spellStart"/>
       <w:r>
         <w:rPr>
           <w:rFonts w:ascii="Browallia New" w:eastAsia="Arial Unicode MS" w:hAnsi="Browallia New" w:cs="Browallia New"/>
@@ -2334,7 +2201,6 @@
         </w:rPr>
         <w:t>ใบรับวางบิลเจ้าหนี้</w:t>
       </w:r>
-      <w:proofErr w:type="spellEnd"/>
       <w:r>
         <w:rPr>
           <w:rFonts w:eastAsia="Arial Unicode MS"/>
@@ -2349,28 +2215,24 @@
         </w:rPr>
         <w:t xml:space="preserve"> </w:t>
       </w:r>
-      <w:proofErr w:type="spellStart"/>
       <w:r>
         <w:rPr>
           <w:rFonts w:ascii="Browallia New" w:eastAsia="Arial Unicode MS" w:hAnsi="Browallia New" w:cs="Browallia New"/>
         </w:rPr>
         <w:t>เอกสารรวบรวมบิลซื้อหลายใบที่เจ้าหนี้มาวางบิล</w:t>
       </w:r>
-      <w:proofErr w:type="spellEnd"/>
-      <w:r>
-        <w:rPr>
-          <w:rFonts w:eastAsia="Arial Unicode MS"/>
-        </w:rPr>
-        <w:t xml:space="preserve"> </w:t>
-      </w:r>
-      <w:proofErr w:type="spellStart"/>
+      <w:r>
+        <w:rPr>
+          <w:rFonts w:eastAsia="Arial Unicode MS"/>
+        </w:rPr>
+        <w:t xml:space="preserve"> </w:t>
+      </w:r>
       <w:r>
         <w:rPr>
           <w:rFonts w:ascii="Browallia New" w:eastAsia="Arial Unicode MS" w:hAnsi="Browallia New" w:cs="Browallia New"/>
         </w:rPr>
         <w:t>ไม่มีผลต่อ</w:t>
       </w:r>
-      <w:proofErr w:type="spellEnd"/>
       <w:r>
         <w:rPr>
           <w:rFonts w:eastAsia="Arial Unicode MS"/>
@@ -2400,7 +2262,6 @@
         </w:rPr>
         <w:t xml:space="preserve">PAY (Payment - </w:t>
       </w:r>
-      <w:proofErr w:type="spellStart"/>
       <w:r>
         <w:rPr>
           <w:rFonts w:ascii="Browallia New" w:eastAsia="Arial Unicode MS" w:hAnsi="Browallia New" w:cs="Browallia New"/>
@@ -2409,7 +2270,6 @@
         </w:rPr>
         <w:t>ใบสำคัญจ่าย</w:t>
       </w:r>
-      <w:proofErr w:type="spellEnd"/>
       <w:r>
         <w:rPr>
           <w:rFonts w:eastAsia="Arial Unicode MS"/>
@@ -2424,28 +2284,24 @@
         </w:rPr>
         <w:t xml:space="preserve"> </w:t>
       </w:r>
-      <w:proofErr w:type="spellStart"/>
       <w:r>
         <w:rPr>
           <w:rFonts w:ascii="Browallia New" w:eastAsia="Arial Unicode MS" w:hAnsi="Browallia New" w:cs="Browallia New"/>
         </w:rPr>
         <w:t>บันทึกจ่ายชำระหนี้ให้ซัพพลายเออร์</w:t>
       </w:r>
-      <w:proofErr w:type="spellEnd"/>
       <w:r>
         <w:rPr>
           <w:rFonts w:eastAsia="Arial Unicode MS"/>
         </w:rPr>
         <w:t xml:space="preserve"> (</w:t>
       </w:r>
-      <w:proofErr w:type="spellStart"/>
       <w:r>
         <w:rPr>
           <w:rFonts w:ascii="Browallia New" w:eastAsia="Arial Unicode MS" w:hAnsi="Browallia New" w:cs="Browallia New"/>
         </w:rPr>
         <w:t>ตัดจาก</w:t>
       </w:r>
-      <w:proofErr w:type="spellEnd"/>
       <w:r>
         <w:rPr>
           <w:rFonts w:eastAsia="Arial Unicode MS"/>
@@ -2475,7 +2331,6 @@
         </w:rPr>
         <w:t xml:space="preserve">DEP_OUT (Deposit Out - </w:t>
       </w:r>
-      <w:proofErr w:type="spellStart"/>
       <w:r>
         <w:rPr>
           <w:rFonts w:ascii="Browallia New" w:eastAsia="Arial Unicode MS" w:hAnsi="Browallia New" w:cs="Browallia New"/>
@@ -2484,7 +2339,6 @@
         </w:rPr>
         <w:t>ใบจ่ายเงินมัดจำ</w:t>
       </w:r>
-      <w:proofErr w:type="spellEnd"/>
       <w:r>
         <w:rPr>
           <w:rFonts w:eastAsia="Arial Unicode MS"/>
@@ -2499,56 +2353,48 @@
         </w:rPr>
         <w:t xml:space="preserve"> </w:t>
       </w:r>
-      <w:proofErr w:type="spellStart"/>
       <w:r>
         <w:rPr>
           <w:rFonts w:ascii="Browallia New" w:eastAsia="Arial Unicode MS" w:hAnsi="Browallia New" w:cs="Browallia New"/>
         </w:rPr>
         <w:t>บันทึกจ่ายเงินมัดจำให้ซัพพลายเออร์</w:t>
       </w:r>
-      <w:proofErr w:type="spellEnd"/>
-      <w:r>
-        <w:rPr>
-          <w:rFonts w:eastAsia="Arial Unicode MS"/>
-        </w:rPr>
-        <w:t xml:space="preserve"> </w:t>
-      </w:r>
-      <w:proofErr w:type="spellStart"/>
+      <w:r>
+        <w:rPr>
+          <w:rFonts w:eastAsia="Arial Unicode MS"/>
+        </w:rPr>
+        <w:t xml:space="preserve"> </w:t>
+      </w:r>
       <w:r>
         <w:rPr>
           <w:rFonts w:ascii="Browallia New" w:eastAsia="Arial Unicode MS" w:hAnsi="Browallia New" w:cs="Browallia New"/>
         </w:rPr>
         <w:t>สามารถนำยอดไปหักเป็นส่วนลดในใบ</w:t>
       </w:r>
-      <w:proofErr w:type="spellEnd"/>
       <w:r>
         <w:rPr>
           <w:rFonts w:eastAsia="Arial Unicode MS"/>
         </w:rPr>
         <w:t xml:space="preserve"> PAY </w:t>
       </w:r>
-      <w:proofErr w:type="spellStart"/>
       <w:r>
         <w:rPr>
           <w:rFonts w:ascii="Browallia New" w:eastAsia="Arial Unicode MS" w:hAnsi="Browallia New" w:cs="Browallia New"/>
         </w:rPr>
         <w:t>ได้</w:t>
       </w:r>
-      <w:proofErr w:type="spellEnd"/>
       <w:r>
         <w:rPr>
           <w:rFonts w:eastAsia="Arial Unicode MS"/>
         </w:rPr>
         <w:t xml:space="preserve"> (</w:t>
       </w:r>
-      <w:proofErr w:type="spellStart"/>
       <w:r>
         <w:rPr>
           <w:rFonts w:ascii="Browallia New" w:eastAsia="Arial Unicode MS" w:hAnsi="Browallia New" w:cs="Browallia New"/>
         </w:rPr>
         <w:t>ตัดมัดจำ</w:t>
       </w:r>
-      <w:proofErr w:type="spellEnd"/>
       <w:r>
         <w:rPr>
           <w:rFonts w:eastAsia="Arial Unicode MS"/>
@@ -2578,7 +2424,6 @@
         </w:rPr>
         <w:t xml:space="preserve">AP_REFUND (PRF - Purchase Refund - </w:t>
       </w:r>
-      <w:proofErr w:type="spellStart"/>
       <w:r>
         <w:rPr>
           <w:rFonts w:ascii="Browallia New" w:eastAsia="Arial Unicode MS" w:hAnsi="Browallia New" w:cs="Browallia New"/>
@@ -2587,7 +2432,6 @@
         </w:rPr>
         <w:t>ใบสำคัญรับเงินคืน</w:t>
       </w:r>
-      <w:proofErr w:type="spellEnd"/>
       <w:r>
         <w:rPr>
           <w:rFonts w:eastAsia="Arial Unicode MS"/>
@@ -2602,42 +2446,36 @@
         </w:rPr>
         <w:t xml:space="preserve"> </w:t>
       </w:r>
-      <w:proofErr w:type="spellStart"/>
       <w:r>
         <w:rPr>
           <w:rFonts w:ascii="Browallia New" w:eastAsia="Arial Unicode MS" w:hAnsi="Browallia New" w:cs="Browallia New"/>
         </w:rPr>
         <w:t>บันทึกการรับเงินคืนจากซัพพลายเออร์</w:t>
       </w:r>
-      <w:proofErr w:type="spellEnd"/>
       <w:r>
         <w:rPr>
           <w:rFonts w:eastAsia="Arial Unicode MS"/>
         </w:rPr>
         <w:t xml:space="preserve"> (</w:t>
       </w:r>
-      <w:proofErr w:type="spellStart"/>
       <w:r>
         <w:rPr>
           <w:rFonts w:ascii="Browallia New" w:eastAsia="Arial Unicode MS" w:hAnsi="Browallia New" w:cs="Browallia New"/>
         </w:rPr>
         <w:t>เช่น</w:t>
       </w:r>
-      <w:proofErr w:type="spellEnd"/>
-      <w:r>
-        <w:rPr>
-          <w:rFonts w:eastAsia="Arial Unicode MS"/>
-        </w:rPr>
-        <w:t xml:space="preserve"> </w:t>
-      </w:r>
-      <w:proofErr w:type="spellStart"/>
+      <w:r>
+        <w:rPr>
+          <w:rFonts w:eastAsia="Arial Unicode MS"/>
+        </w:rPr>
+        <w:t xml:space="preserve"> </w:t>
+      </w:r>
       <w:r>
         <w:rPr>
           <w:rFonts w:ascii="Browallia New" w:eastAsia="Arial Unicode MS" w:hAnsi="Browallia New" w:cs="Browallia New"/>
         </w:rPr>
         <w:t>รับคืนมัดจำ</w:t>
       </w:r>
-      <w:proofErr w:type="spellEnd"/>
       <w:r>
         <w:rPr>
           <w:rFonts w:eastAsia="Arial Unicode MS"/>
@@ -2667,7 +2505,6 @@
         </w:rPr>
         <w:t xml:space="preserve">AP_WRITEOFF (PWO - Purchase Write-off - </w:t>
       </w:r>
-      <w:proofErr w:type="spellStart"/>
       <w:r>
         <w:rPr>
           <w:rFonts w:ascii="Browallia New" w:eastAsia="Arial Unicode MS" w:hAnsi="Browallia New" w:cs="Browallia New"/>
@@ -2676,7 +2513,6 @@
         </w:rPr>
         <w:t>ใบสำคัญตัดหนี้</w:t>
       </w:r>
-      <w:proofErr w:type="spellEnd"/>
       <w:r>
         <w:rPr>
           <w:rFonts w:eastAsia="Arial Unicode MS"/>
@@ -2691,56 +2527,48 @@
         </w:rPr>
         <w:t xml:space="preserve"> </w:t>
       </w:r>
-      <w:proofErr w:type="spellStart"/>
       <w:r>
         <w:rPr>
           <w:rFonts w:ascii="Browallia New" w:eastAsia="Arial Unicode MS" w:hAnsi="Browallia New" w:cs="Browallia New"/>
         </w:rPr>
         <w:t>บันทึกการตัดยอดเจ้าหนี้</w:t>
       </w:r>
-      <w:proofErr w:type="spellEnd"/>
       <w:r>
         <w:rPr>
           <w:rFonts w:eastAsia="Arial Unicode MS"/>
         </w:rPr>
         <w:t xml:space="preserve"> (</w:t>
       </w:r>
-      <w:proofErr w:type="spellStart"/>
       <w:r>
         <w:rPr>
           <w:rFonts w:ascii="Browallia New" w:eastAsia="Arial Unicode MS" w:hAnsi="Browallia New" w:cs="Browallia New"/>
         </w:rPr>
         <w:t>เช่น</w:t>
       </w:r>
-      <w:proofErr w:type="spellEnd"/>
-      <w:r>
-        <w:rPr>
-          <w:rFonts w:eastAsia="Arial Unicode MS"/>
-        </w:rPr>
-        <w:t xml:space="preserve"> </w:t>
-      </w:r>
-      <w:proofErr w:type="spellStart"/>
+      <w:r>
+        <w:rPr>
+          <w:rFonts w:eastAsia="Arial Unicode MS"/>
+        </w:rPr>
+        <w:t xml:space="preserve"> </w:t>
+      </w:r>
       <w:r>
         <w:rPr>
           <w:rFonts w:ascii="Browallia New" w:eastAsia="Arial Unicode MS" w:hAnsi="Browallia New" w:cs="Browallia New"/>
         </w:rPr>
         <w:t>ซัพพลายเออร์ยกหนี้ให้</w:t>
       </w:r>
-      <w:proofErr w:type="spellEnd"/>
-      <w:r>
-        <w:rPr>
-          <w:rFonts w:eastAsia="Arial Unicode MS"/>
-        </w:rPr>
-        <w:t xml:space="preserve"> </w:t>
-      </w:r>
-      <w:proofErr w:type="spellStart"/>
+      <w:r>
+        <w:rPr>
+          <w:rFonts w:eastAsia="Arial Unicode MS"/>
+        </w:rPr>
+        <w:t xml:space="preserve"> </w:t>
+      </w:r>
       <w:r>
         <w:rPr>
           <w:rFonts w:ascii="Browallia New" w:eastAsia="Arial Unicode MS" w:hAnsi="Browallia New" w:cs="Browallia New"/>
         </w:rPr>
         <w:t>หรือตัดเศษบัญชี</w:t>
       </w:r>
-      <w:proofErr w:type="spellEnd"/>
       <w:r>
         <w:rPr>
           <w:rFonts w:eastAsia="Arial Unicode MS"/>
@@ -2752,14 +2580,12 @@
       <w:pPr>
         <w:pStyle w:val="Heading3"/>
       </w:pPr>
-      <w:proofErr w:type="spellStart"/>
       <w:r>
         <w:rPr>
           <w:rFonts w:ascii="Browallia New" w:eastAsia="Arial Unicode MS" w:hAnsi="Browallia New" w:cs="Browallia New"/>
         </w:rPr>
         <w:t>กลุ่มงานบริหารคลังสินค้าและผลิต</w:t>
       </w:r>
-      <w:proofErr w:type="spellEnd"/>
       <w:r>
         <w:rPr>
           <w:rFonts w:eastAsia="Arial Unicode MS"/>
@@ -2789,7 +2615,6 @@
         </w:rPr>
         <w:t xml:space="preserve">STK_OB (Stock Opening Balance - </w:t>
       </w:r>
-      <w:proofErr w:type="spellStart"/>
       <w:r>
         <w:rPr>
           <w:rFonts w:ascii="Browallia New" w:eastAsia="Arial Unicode MS" w:hAnsi="Browallia New" w:cs="Browallia New"/>
@@ -2798,7 +2623,6 @@
         </w:rPr>
         <w:t>ยอดยกมา</w:t>
       </w:r>
-      <w:proofErr w:type="spellEnd"/>
       <w:r>
         <w:rPr>
           <w:rFonts w:eastAsia="Arial Unicode MS"/>
@@ -2813,56 +2637,42 @@
         </w:rPr>
         <w:t xml:space="preserve"> </w:t>
       </w:r>
-      <w:proofErr w:type="spellStart"/>
       <w:r>
         <w:rPr>
           <w:rFonts w:ascii="Browallia New" w:eastAsia="Arial Unicode MS" w:hAnsi="Browallia New" w:cs="Browallia New"/>
         </w:rPr>
         <w:t>เอกสารตั้งต้นสต็อก</w:t>
       </w:r>
-      <w:proofErr w:type="spellEnd"/>
       <w:r>
         <w:rPr>
           <w:rFonts w:eastAsia="Arial Unicode MS"/>
         </w:rPr>
         <w:t xml:space="preserve"> (</w:t>
       </w:r>
-      <w:proofErr w:type="spellStart"/>
       <w:r>
         <w:rPr>
           <w:rFonts w:ascii="Browallia New" w:eastAsia="Arial Unicode MS" w:hAnsi="Browallia New" w:cs="Browallia New"/>
         </w:rPr>
         <w:t>รหัสรันนิ่ง</w:t>
       </w:r>
-      <w:proofErr w:type="spellEnd"/>
       <w:r>
         <w:rPr>
           <w:rFonts w:eastAsia="Arial Unicode MS"/>
         </w:rPr>
         <w:t xml:space="preserve">: SOB-YYMM-XXXX) </w:t>
       </w:r>
-      <w:proofErr w:type="spellStart"/>
       <w:r>
         <w:rPr>
           <w:rFonts w:ascii="Browallia New" w:eastAsia="Arial Unicode MS" w:hAnsi="Browallia New" w:cs="Browallia New"/>
         </w:rPr>
         <w:t>บันทึกผ่านตาราง</w:t>
       </w:r>
-      <w:proofErr w:type="spellEnd"/>
-      <w:r>
-        <w:rPr>
-          <w:rFonts w:eastAsia="Arial Unicode MS"/>
-        </w:rPr>
-        <w:t xml:space="preserve"> </w:t>
-      </w:r>
-      <w:proofErr w:type="spellStart"/>
-      <w:r>
-        <w:rPr>
-          <w:rFonts w:eastAsia="Arial Unicode MS"/>
-        </w:rPr>
-        <w:t>inventory_ledger</w:t>
-      </w:r>
-      <w:proofErr w:type="spellEnd"/>
+      <w:r>
+        <w:rPr>
+          <w:rFonts w:eastAsia="Arial Unicode MS"/>
+        </w:rPr>
+        <w:t xml:space="preserve"> inventory_ledger</w:t>
+      </w:r>
     </w:p>
     <w:p>
       <w:pPr>
@@ -2886,7 +2696,6 @@
         </w:rPr>
         <w:t xml:space="preserve">STK_ADJ (Stock Adjustment - </w:t>
       </w:r>
-      <w:proofErr w:type="spellStart"/>
       <w:r>
         <w:rPr>
           <w:rFonts w:ascii="Browallia New" w:eastAsia="Arial Unicode MS" w:hAnsi="Browallia New" w:cs="Browallia New"/>
@@ -2895,7 +2704,6 @@
         </w:rPr>
         <w:t>ปรับปรุงสต็อก</w:t>
       </w:r>
-      <w:proofErr w:type="spellEnd"/>
       <w:r>
         <w:rPr>
           <w:rFonts w:eastAsia="Arial Unicode MS"/>
@@ -2910,112 +2718,84 @@
         </w:rPr>
         <w:t xml:space="preserve"> </w:t>
       </w:r>
-      <w:proofErr w:type="spellStart"/>
       <w:r>
         <w:rPr>
           <w:rFonts w:ascii="Browallia New" w:eastAsia="Arial Unicode MS" w:hAnsi="Browallia New" w:cs="Browallia New"/>
         </w:rPr>
         <w:t>เอกสารปรับปรุงสต็อก</w:t>
       </w:r>
-      <w:proofErr w:type="spellEnd"/>
       <w:r>
         <w:rPr>
           <w:rFonts w:eastAsia="Arial Unicode MS"/>
         </w:rPr>
         <w:t xml:space="preserve"> (</w:t>
       </w:r>
-      <w:proofErr w:type="spellStart"/>
       <w:r>
         <w:rPr>
           <w:rFonts w:ascii="Browallia New" w:eastAsia="Arial Unicode MS" w:hAnsi="Browallia New" w:cs="Browallia New"/>
         </w:rPr>
         <w:t>ตรวจนับ</w:t>
       </w:r>
-      <w:proofErr w:type="spellEnd"/>
       <w:r>
         <w:rPr>
           <w:rFonts w:eastAsia="Arial Unicode MS"/>
         </w:rPr>
         <w:t>/</w:t>
       </w:r>
-      <w:proofErr w:type="spellStart"/>
       <w:r>
         <w:rPr>
           <w:rFonts w:ascii="Browallia New" w:eastAsia="Arial Unicode MS" w:hAnsi="Browallia New" w:cs="Browallia New"/>
         </w:rPr>
         <w:t>สูญหาย</w:t>
       </w:r>
-      <w:proofErr w:type="spellEnd"/>
       <w:r>
         <w:rPr>
           <w:rFonts w:eastAsia="Arial Unicode MS"/>
         </w:rPr>
         <w:t>) (</w:t>
       </w:r>
-      <w:proofErr w:type="spellStart"/>
       <w:r>
         <w:rPr>
           <w:rFonts w:ascii="Browallia New" w:eastAsia="Arial Unicode MS" w:hAnsi="Browallia New" w:cs="Browallia New"/>
         </w:rPr>
         <w:t>รหัสรันนิ่ง</w:t>
       </w:r>
-      <w:proofErr w:type="spellEnd"/>
       <w:r>
         <w:rPr>
           <w:rFonts w:eastAsia="Arial Unicode MS"/>
         </w:rPr>
         <w:t xml:space="preserve">: SAD-YYMM-XXXX) </w:t>
       </w:r>
-      <w:proofErr w:type="spellStart"/>
       <w:r>
         <w:rPr>
           <w:rFonts w:ascii="Browallia New" w:eastAsia="Arial Unicode MS" w:hAnsi="Browallia New" w:cs="Browallia New"/>
         </w:rPr>
         <w:t>บันทึกผ่านตาราง</w:t>
       </w:r>
-      <w:proofErr w:type="spellEnd"/>
-      <w:r>
-        <w:rPr>
-          <w:rFonts w:eastAsia="Arial Unicode MS"/>
-        </w:rPr>
-        <w:t xml:space="preserve"> </w:t>
-      </w:r>
-      <w:proofErr w:type="spellStart"/>
-      <w:r>
-        <w:rPr>
-          <w:rFonts w:eastAsia="Arial Unicode MS"/>
-        </w:rPr>
-        <w:t>inventory_ledger</w:t>
-      </w:r>
-      <w:proofErr w:type="spellEnd"/>
-      <w:r>
-        <w:rPr>
-          <w:rFonts w:eastAsia="Arial Unicode MS"/>
-        </w:rPr>
-        <w:t xml:space="preserve"> </w:t>
-      </w:r>
-      <w:proofErr w:type="spellStart"/>
+      <w:r>
+        <w:rPr>
+          <w:rFonts w:eastAsia="Arial Unicode MS"/>
+        </w:rPr>
+        <w:t xml:space="preserve"> inventory_ledger </w:t>
+      </w:r>
       <w:r>
         <w:rPr>
           <w:rFonts w:ascii="Browallia New" w:eastAsia="Arial Unicode MS" w:hAnsi="Browallia New" w:cs="Browallia New"/>
         </w:rPr>
         <w:t>พร้อมคำนวณ</w:t>
       </w:r>
-      <w:proofErr w:type="spellEnd"/>
       <w:r>
         <w:rPr>
           <w:rFonts w:eastAsia="Arial Unicode MS"/>
         </w:rPr>
         <w:t xml:space="preserve"> Variance </w:t>
       </w:r>
-      <w:proofErr w:type="spellStart"/>
       <w:r>
         <w:rPr>
           <w:rFonts w:ascii="Browallia New" w:eastAsia="Arial Unicode MS" w:hAnsi="Browallia New" w:cs="Browallia New"/>
         </w:rPr>
         <w:t>อัตโนมัติ</w:t>
       </w:r>
-      <w:proofErr w:type="spellEnd"/>
     </w:p>
     <w:p>
       <w:pPr>
@@ -3188,13 +2968,8 @@
         </w:rPr>
         <w:t xml:space="preserve"> </w:t>
       </w:r>
-      <w:proofErr w:type="spellStart"/>
-      <w:r>
-        <w:t>document_items</w:t>
-      </w:r>
-      <w:proofErr w:type="spellEnd"/>
-      <w:r>
-        <w:t xml:space="preserve">)" </w:t>
+      <w:r>
+        <w:t xml:space="preserve">document_items)" </w:t>
       </w:r>
       <w:r>
         <w:rPr>
@@ -3238,13 +3013,8 @@
         </w:rPr>
         <w:t xml:space="preserve"> </w:t>
       </w:r>
-      <w:proofErr w:type="spellStart"/>
-      <w:r>
-        <w:t>production_job_operations</w:t>
-      </w:r>
-      <w:proofErr w:type="spellEnd"/>
-      <w:r>
-        <w:t xml:space="preserve">)" </w:t>
+      <w:r>
+        <w:t xml:space="preserve">production_job_operations)" </w:t>
       </w:r>
       <w:r>
         <w:rPr>
@@ -3283,14 +3053,12 @@
       <w:pPr>
         <w:pStyle w:val="Heading3"/>
       </w:pPr>
-      <w:proofErr w:type="spellStart"/>
       <w:r>
         <w:rPr>
           <w:rFonts w:ascii="Browallia New" w:eastAsia="Arial Unicode MS" w:hAnsi="Browallia New" w:cs="Browallia New"/>
         </w:rPr>
         <w:t>กลุ่มงานค่าใช้จ่ายและสินทรัพย์</w:t>
       </w:r>
-      <w:proofErr w:type="spellEnd"/>
       <w:r>
         <w:rPr>
           <w:rFonts w:eastAsia="Arial Unicode MS"/>
@@ -3320,7 +3088,6 @@
         </w:rPr>
         <w:t xml:space="preserve">EXP (Expense Voucher - </w:t>
       </w:r>
-      <w:proofErr w:type="spellStart"/>
       <w:r>
         <w:rPr>
           <w:rFonts w:ascii="Browallia New" w:eastAsia="Arial Unicode MS" w:hAnsi="Browallia New" w:cs="Browallia New"/>
@@ -3329,7 +3096,6 @@
         </w:rPr>
         <w:t>ใบสำคัญจ่าย</w:t>
       </w:r>
-      <w:proofErr w:type="spellEnd"/>
       <w:r>
         <w:rPr>
           <w:rFonts w:eastAsia="Arial Unicode MS"/>
@@ -3338,7 +3104,6 @@
         </w:rPr>
         <w:t>/</w:t>
       </w:r>
-      <w:proofErr w:type="spellStart"/>
       <w:r>
         <w:rPr>
           <w:rFonts w:ascii="Browallia New" w:eastAsia="Arial Unicode MS" w:hAnsi="Browallia New" w:cs="Browallia New"/>
@@ -3347,7 +3112,6 @@
         </w:rPr>
         <w:t>บิลค่าใช้จ่าย</w:t>
       </w:r>
-      <w:proofErr w:type="spellEnd"/>
       <w:r>
         <w:rPr>
           <w:rFonts w:eastAsia="Arial Unicode MS"/>
@@ -3362,84 +3126,72 @@
         </w:rPr>
         <w:t xml:space="preserve"> </w:t>
       </w:r>
-      <w:proofErr w:type="spellStart"/>
       <w:r>
         <w:rPr>
           <w:rFonts w:ascii="Browallia New" w:eastAsia="Arial Unicode MS" w:hAnsi="Browallia New" w:cs="Browallia New"/>
         </w:rPr>
         <w:t>บันทึกค่าใช้จ่ายดำเนินงาน</w:t>
       </w:r>
-      <w:proofErr w:type="spellEnd"/>
       <w:r>
         <w:rPr>
           <w:rFonts w:eastAsia="Arial Unicode MS"/>
         </w:rPr>
         <w:t xml:space="preserve"> (OPEX) </w:t>
       </w:r>
-      <w:proofErr w:type="spellStart"/>
       <w:r>
         <w:rPr>
           <w:rFonts w:ascii="Browallia New" w:eastAsia="Arial Unicode MS" w:hAnsi="Browallia New" w:cs="Browallia New"/>
         </w:rPr>
         <w:t>ทั่วไป</w:t>
       </w:r>
-      <w:proofErr w:type="spellEnd"/>
       <w:r>
         <w:rPr>
           <w:rFonts w:eastAsia="Arial Unicode MS"/>
         </w:rPr>
         <w:t xml:space="preserve"> (</w:t>
       </w:r>
-      <w:proofErr w:type="spellStart"/>
       <w:r>
         <w:rPr>
           <w:rFonts w:ascii="Browallia New" w:eastAsia="Arial Unicode MS" w:hAnsi="Browallia New" w:cs="Browallia New"/>
         </w:rPr>
         <w:t>เช่น</w:t>
       </w:r>
-      <w:proofErr w:type="spellEnd"/>
-      <w:r>
-        <w:rPr>
-          <w:rFonts w:eastAsia="Arial Unicode MS"/>
-        </w:rPr>
-        <w:t xml:space="preserve"> </w:t>
-      </w:r>
-      <w:proofErr w:type="spellStart"/>
+      <w:r>
+        <w:rPr>
+          <w:rFonts w:eastAsia="Arial Unicode MS"/>
+        </w:rPr>
+        <w:t xml:space="preserve"> </w:t>
+      </w:r>
       <w:r>
         <w:rPr>
           <w:rFonts w:ascii="Browallia New" w:eastAsia="Arial Unicode MS" w:hAnsi="Browallia New" w:cs="Browallia New"/>
         </w:rPr>
         <w:t>ค่าไฟ</w:t>
       </w:r>
-      <w:proofErr w:type="spellEnd"/>
       <w:r>
         <w:rPr>
           <w:rFonts w:eastAsia="Arial Unicode MS"/>
         </w:rPr>
         <w:t xml:space="preserve">, </w:t>
       </w:r>
-      <w:proofErr w:type="spellStart"/>
       <w:r>
         <w:rPr>
           <w:rFonts w:ascii="Browallia New" w:eastAsia="Arial Unicode MS" w:hAnsi="Browallia New" w:cs="Browallia New"/>
         </w:rPr>
         <w:t>ค่าน้ำ</w:t>
       </w:r>
-      <w:proofErr w:type="spellEnd"/>
       <w:r>
         <w:rPr>
           <w:rFonts w:eastAsia="Arial Unicode MS"/>
         </w:rPr>
         <w:t xml:space="preserve">, </w:t>
       </w:r>
-      <w:proofErr w:type="spellStart"/>
       <w:r>
         <w:rPr>
           <w:rFonts w:ascii="Browallia New" w:eastAsia="Arial Unicode MS" w:hAnsi="Browallia New" w:cs="Browallia New"/>
         </w:rPr>
         <w:t>ค่าซ่อมแซม</w:t>
       </w:r>
-      <w:proofErr w:type="spellEnd"/>
       <w:r>
         <w:rPr>
           <w:rFonts w:eastAsia="Arial Unicode MS"/>
@@ -3469,7 +3221,6 @@
         </w:rPr>
         <w:t>Fixed Asset (</w:t>
       </w:r>
-      <w:proofErr w:type="spellStart"/>
       <w:r>
         <w:rPr>
           <w:rFonts w:ascii="Browallia New" w:eastAsia="Arial Unicode MS" w:hAnsi="Browallia New" w:cs="Browallia New"/>
@@ -3478,7 +3229,6 @@
         </w:rPr>
         <w:t>ทะเบียนสินทรัพย์</w:t>
       </w:r>
-      <w:proofErr w:type="spellEnd"/>
       <w:r>
         <w:rPr>
           <w:rFonts w:eastAsia="Arial Unicode MS"/>
@@ -3493,84 +3243,72 @@
         </w:rPr>
         <w:t xml:space="preserve"> </w:t>
       </w:r>
-      <w:proofErr w:type="spellStart"/>
       <w:r>
         <w:rPr>
           <w:rFonts w:ascii="Browallia New" w:eastAsia="Arial Unicode MS" w:hAnsi="Browallia New" w:cs="Browallia New"/>
         </w:rPr>
         <w:t>สำหรับบิล</w:t>
       </w:r>
-      <w:proofErr w:type="spellEnd"/>
       <w:r>
         <w:rPr>
           <w:rFonts w:eastAsia="Arial Unicode MS"/>
         </w:rPr>
         <w:t xml:space="preserve"> EXP </w:t>
       </w:r>
-      <w:proofErr w:type="spellStart"/>
       <w:r>
         <w:rPr>
           <w:rFonts w:ascii="Browallia New" w:eastAsia="Arial Unicode MS" w:hAnsi="Browallia New" w:cs="Browallia New"/>
         </w:rPr>
         <w:t>ที่ระบุหมวดหมู่</w:t>
       </w:r>
-      <w:proofErr w:type="spellEnd"/>
       <w:r>
         <w:rPr>
           <w:rFonts w:eastAsia="Arial Unicode MS"/>
         </w:rPr>
         <w:t xml:space="preserve"> "</w:t>
       </w:r>
-      <w:proofErr w:type="spellStart"/>
       <w:r>
         <w:rPr>
           <w:rFonts w:ascii="Browallia New" w:eastAsia="Arial Unicode MS" w:hAnsi="Browallia New" w:cs="Browallia New"/>
         </w:rPr>
         <w:t>พักสินทรัพย์รอขึ้นทะเบียน</w:t>
       </w:r>
-      <w:proofErr w:type="spellEnd"/>
       <w:r>
         <w:rPr>
           <w:rFonts w:eastAsia="Arial Unicode MS"/>
         </w:rPr>
         <w:t xml:space="preserve"> (Asset Clearing)" </w:t>
       </w:r>
-      <w:proofErr w:type="spellStart"/>
       <w:r>
         <w:rPr>
           <w:rFonts w:ascii="Browallia New" w:eastAsia="Arial Unicode MS" w:hAnsi="Browallia New" w:cs="Browallia New"/>
         </w:rPr>
         <w:t>จะต้องนำมาขึ้นทะเบียนเป็น</w:t>
       </w:r>
-      <w:proofErr w:type="spellEnd"/>
       <w:r>
         <w:rPr>
           <w:rFonts w:eastAsia="Arial Unicode MS"/>
         </w:rPr>
         <w:t xml:space="preserve"> Fixed Asset </w:t>
       </w:r>
-      <w:proofErr w:type="spellStart"/>
       <w:r>
         <w:rPr>
           <w:rFonts w:ascii="Browallia New" w:eastAsia="Arial Unicode MS" w:hAnsi="Browallia New" w:cs="Browallia New"/>
         </w:rPr>
         <w:t>เพื่อเตรียมตัดค่าเสื่อมราคา</w:t>
       </w:r>
-      <w:proofErr w:type="spellEnd"/>
       <w:r>
         <w:rPr>
           <w:rFonts w:eastAsia="Arial Unicode MS"/>
         </w:rPr>
         <w:t xml:space="preserve"> (Depreciation) </w:t>
       </w:r>
-      <w:proofErr w:type="spellStart"/>
       <w:r>
         <w:rPr>
           <w:rFonts w:ascii="Browallia New" w:eastAsia="Arial Unicode MS" w:hAnsi="Browallia New" w:cs="Browallia New"/>
         </w:rPr>
         <w:t>ตามมาตรฐาน</w:t>
       </w:r>
-      <w:proofErr w:type="spellEnd"/>
       <w:r>
         <w:rPr>
           <w:rFonts w:eastAsia="Arial Unicode MS"/>
@@ -3588,14 +3326,12 @@
         </w:rPr>
         <w:t xml:space="preserve">2. </w:t>
       </w:r>
-      <w:proofErr w:type="spellStart"/>
       <w:r>
         <w:rPr>
           <w:rFonts w:ascii="Browallia New" w:eastAsia="Arial Unicode MS" w:hAnsi="Browallia New" w:cs="Browallia New"/>
         </w:rPr>
         <w:t>วงจรชีวิตของเอกสาร</w:t>
       </w:r>
-      <w:proofErr w:type="spellEnd"/>
       <w:r>
         <w:rPr>
           <w:rFonts w:eastAsia="Arial Unicode MS"/>
@@ -3613,42 +3349,36 @@
           <w:between w:val="nil"/>
         </w:pBdr>
       </w:pPr>
-      <w:proofErr w:type="spellStart"/>
       <w:r>
         <w:rPr>
           <w:rFonts w:ascii="Browallia New" w:eastAsia="Arial Unicode MS" w:hAnsi="Browallia New" w:cs="Browallia New"/>
         </w:rPr>
         <w:t>เพื่อรักษาความถูกต้องของข้อมูลตามหลักการบัญชี</w:t>
       </w:r>
-      <w:proofErr w:type="spellEnd"/>
       <w:r>
         <w:rPr>
           <w:rFonts w:eastAsia="Arial Unicode MS"/>
         </w:rPr>
         <w:t xml:space="preserve"> ERP </w:t>
       </w:r>
-      <w:proofErr w:type="spellStart"/>
       <w:r>
         <w:rPr>
           <w:rFonts w:ascii="Browallia New" w:eastAsia="Arial Unicode MS" w:hAnsi="Browallia New" w:cs="Browallia New"/>
         </w:rPr>
         <w:t>ทั่วโลก</w:t>
       </w:r>
-      <w:proofErr w:type="spellEnd"/>
-      <w:r>
-        <w:rPr>
-          <w:rFonts w:eastAsia="Arial Unicode MS"/>
-        </w:rPr>
-        <w:t xml:space="preserve"> </w:t>
-      </w:r>
-      <w:proofErr w:type="spellStart"/>
+      <w:r>
+        <w:rPr>
+          <w:rFonts w:eastAsia="Arial Unicode MS"/>
+        </w:rPr>
+        <w:t xml:space="preserve"> </w:t>
+      </w:r>
       <w:r>
         <w:rPr>
           <w:rFonts w:ascii="Browallia New" w:eastAsia="Arial Unicode MS" w:hAnsi="Browallia New" w:cs="Browallia New"/>
         </w:rPr>
         <w:t>เราบังคับใช้กฎ</w:t>
       </w:r>
-      <w:proofErr w:type="spellEnd"/>
       <w:r>
         <w:rPr>
           <w:rFonts w:eastAsia="Arial Unicode MS"/>
@@ -3668,28 +3398,24 @@
         </w:rPr>
         <w:t xml:space="preserve"> (</w:t>
       </w:r>
-      <w:proofErr w:type="spellStart"/>
       <w:r>
         <w:rPr>
           <w:rFonts w:ascii="Browallia New" w:eastAsia="Arial Unicode MS" w:hAnsi="Browallia New" w:cs="Browallia New"/>
         </w:rPr>
         <w:t>รันเลขทีหลัง</w:t>
       </w:r>
-      <w:proofErr w:type="spellEnd"/>
       <w:r>
         <w:rPr>
           <w:rFonts w:eastAsia="Arial Unicode MS"/>
         </w:rPr>
         <w:t xml:space="preserve">) </w:t>
       </w:r>
-      <w:proofErr w:type="spellStart"/>
       <w:r>
         <w:rPr>
           <w:rFonts w:ascii="Browallia New" w:eastAsia="Arial Unicode MS" w:hAnsi="Browallia New" w:cs="Browallia New"/>
         </w:rPr>
         <w:t>และ</w:t>
       </w:r>
-      <w:proofErr w:type="spellEnd"/>
       <w:r>
         <w:rPr>
           <w:rFonts w:eastAsia="Arial Unicode MS"/>
@@ -3709,14 +3435,12 @@
         </w:rPr>
         <w:t xml:space="preserve"> </w:t>
       </w:r>
-      <w:proofErr w:type="spellStart"/>
       <w:r>
         <w:rPr>
           <w:rFonts w:ascii="Browallia New" w:eastAsia="Arial Unicode MS" w:hAnsi="Browallia New" w:cs="Browallia New"/>
         </w:rPr>
         <w:t>ดังนี้</w:t>
       </w:r>
-      <w:proofErr w:type="spellEnd"/>
       <w:r>
         <w:rPr>
           <w:rFonts w:eastAsia="Arial Unicode MS"/>
@@ -3746,7 +3470,6 @@
         </w:rPr>
         <w:t>DRAFT (</w:t>
       </w:r>
-      <w:proofErr w:type="spellStart"/>
       <w:r>
         <w:rPr>
           <w:rFonts w:ascii="Browallia New" w:eastAsia="Arial Unicode MS" w:hAnsi="Browallia New" w:cs="Browallia New"/>
@@ -3755,7 +3478,6 @@
         </w:rPr>
         <w:t>ร่างเอกสาร</w:t>
       </w:r>
-      <w:proofErr w:type="spellEnd"/>
       <w:r>
         <w:rPr>
           <w:rFonts w:eastAsia="Arial Unicode MS"/>
@@ -3779,42 +3501,30 @@
           <w:between w:val="nil"/>
         </w:pBdr>
       </w:pPr>
-      <w:proofErr w:type="spellStart"/>
       <w:r>
         <w:rPr>
           <w:rFonts w:ascii="Browallia New" w:eastAsia="Arial Unicode MS" w:hAnsi="Browallia New" w:cs="Browallia New"/>
         </w:rPr>
         <w:t>ระบบจะยังไม่รันเลขที่เอกสารจริง</w:t>
       </w:r>
-      <w:proofErr w:type="spellEnd"/>
-      <w:r>
-        <w:rPr>
-          <w:rFonts w:eastAsia="Arial Unicode MS"/>
-        </w:rPr>
-        <w:t xml:space="preserve"> </w:t>
-      </w:r>
-      <w:proofErr w:type="spellStart"/>
+      <w:r>
+        <w:rPr>
+          <w:rFonts w:eastAsia="Arial Unicode MS"/>
+        </w:rPr>
+        <w:t xml:space="preserve"> </w:t>
+      </w:r>
       <w:r>
         <w:rPr>
           <w:rFonts w:ascii="Browallia New" w:eastAsia="Arial Unicode MS" w:hAnsi="Browallia New" w:cs="Browallia New"/>
         </w:rPr>
         <w:t>จะใช้รหัสชั่วคราว</w:t>
       </w:r>
-      <w:proofErr w:type="spellEnd"/>
-      <w:r>
-        <w:rPr>
-          <w:rFonts w:eastAsia="Arial Unicode MS"/>
-        </w:rPr>
-        <w:t xml:space="preserve"> DRAFT-</w:t>
-      </w:r>
-      <w:proofErr w:type="spellStart"/>
-      <w:r>
-        <w:rPr>
-          <w:rFonts w:eastAsia="Arial Unicode MS"/>
-        </w:rPr>
-        <w:t>YYYYMMDDHHmmss</w:t>
-      </w:r>
-      <w:proofErr w:type="spellEnd"/>
+      <w:r>
+        <w:rPr>
+          <w:rFonts w:eastAsia="Arial Unicode MS"/>
+        </w:rPr>
+        <w:t xml:space="preserve"> DRAFT-YYYYMMDDHHmmss</w:t>
+      </w:r>
     </w:p>
     <w:p>
       <w:pPr>
@@ -3830,28 +3540,24 @@
           <w:between w:val="nil"/>
         </w:pBdr>
       </w:pPr>
-      <w:proofErr w:type="spellStart"/>
       <w:r>
         <w:rPr>
           <w:rFonts w:ascii="Browallia New" w:eastAsia="Arial Unicode MS" w:hAnsi="Browallia New" w:cs="Browallia New"/>
         </w:rPr>
         <w:t>ข้อมูลยังไม่มีผลใดๆ</w:t>
       </w:r>
-      <w:proofErr w:type="spellEnd"/>
-      <w:r>
-        <w:rPr>
-          <w:rFonts w:eastAsia="Arial Unicode MS"/>
-        </w:rPr>
-        <w:t xml:space="preserve"> </w:t>
-      </w:r>
-      <w:proofErr w:type="spellStart"/>
+      <w:r>
+        <w:rPr>
+          <w:rFonts w:eastAsia="Arial Unicode MS"/>
+        </w:rPr>
+        <w:t xml:space="preserve"> </w:t>
+      </w:r>
       <w:r>
         <w:rPr>
           <w:rFonts w:ascii="Browallia New" w:eastAsia="Arial Unicode MS" w:hAnsi="Browallia New" w:cs="Browallia New"/>
         </w:rPr>
         <w:t>ทางบัญชีและสต็อก</w:t>
       </w:r>
-      <w:proofErr w:type="spellEnd"/>
     </w:p>
     <w:p>
       <w:pPr>
@@ -3867,14 +3573,12 @@
           <w:between w:val="nil"/>
         </w:pBdr>
       </w:pPr>
-      <w:proofErr w:type="spellStart"/>
       <w:r>
         <w:rPr>
           <w:rFonts w:ascii="Browallia New" w:eastAsia="Arial Unicode MS" w:hAnsi="Browallia New" w:cs="Browallia New"/>
         </w:rPr>
         <w:t>สามารถแก้ไขข้อมูลได้อิสระ</w:t>
       </w:r>
-      <w:proofErr w:type="spellEnd"/>
     </w:p>
     <w:p>
       <w:pPr>
@@ -3890,35 +3594,30 @@
           <w:between w:val="nil"/>
         </w:pBdr>
       </w:pPr>
-      <w:proofErr w:type="spellStart"/>
       <w:r>
         <w:rPr>
           <w:rFonts w:ascii="Browallia New" w:eastAsia="Arial Unicode MS" w:hAnsi="Browallia New" w:cs="Browallia New"/>
         </w:rPr>
         <w:t>หากต้องการยกเลิก</w:t>
       </w:r>
-      <w:proofErr w:type="spellEnd"/>
-      <w:r>
-        <w:rPr>
-          <w:rFonts w:eastAsia="Arial Unicode MS"/>
-        </w:rPr>
-        <w:t xml:space="preserve"> </w:t>
-      </w:r>
-      <w:proofErr w:type="spellStart"/>
+      <w:r>
+        <w:rPr>
+          <w:rFonts w:eastAsia="Arial Unicode MS"/>
+        </w:rPr>
+        <w:t xml:space="preserve"> </w:t>
+      </w:r>
       <w:r>
         <w:rPr>
           <w:rFonts w:ascii="Browallia New" w:eastAsia="Arial Unicode MS" w:hAnsi="Browallia New" w:cs="Browallia New"/>
         </w:rPr>
         <w:t>ต้องใช้คำสั่ง</w:t>
       </w:r>
-      <w:proofErr w:type="spellEnd"/>
-      <w:r>
-        <w:rPr>
-          <w:rFonts w:eastAsia="Arial Unicode MS"/>
-        </w:rPr>
-        <w:t xml:space="preserve"> </w:t>
-      </w:r>
-      <w:proofErr w:type="spellStart"/>
+      <w:r>
+        <w:rPr>
+          <w:rFonts w:eastAsia="Arial Unicode MS"/>
+        </w:rPr>
+        <w:t xml:space="preserve"> </w:t>
+      </w:r>
       <w:r>
         <w:rPr>
           <w:rFonts w:ascii="Browallia New" w:eastAsia="Arial Unicode MS" w:hAnsi="Browallia New" w:cs="Browallia New"/>
@@ -3927,7 +3626,6 @@
         </w:rPr>
         <w:t>ลบ</w:t>
       </w:r>
-      <w:proofErr w:type="spellEnd"/>
       <w:r>
         <w:rPr>
           <w:rFonts w:eastAsia="Arial Unicode MS"/>
@@ -3942,14 +3640,12 @@
         </w:rPr>
         <w:t xml:space="preserve"> </w:t>
       </w:r>
-      <w:proofErr w:type="spellStart"/>
       <w:r>
         <w:rPr>
           <w:rFonts w:ascii="Browallia New" w:eastAsia="Arial Unicode MS" w:hAnsi="Browallia New" w:cs="Browallia New"/>
         </w:rPr>
         <w:t>เท่านั้น</w:t>
       </w:r>
-      <w:proofErr w:type="spellEnd"/>
     </w:p>
     <w:p>
       <w:pPr>
@@ -3974,7 +3670,6 @@
         <w:lastRenderedPageBreak/>
         <w:t>PENDING (</w:t>
       </w:r>
-      <w:proofErr w:type="spellStart"/>
       <w:r>
         <w:rPr>
           <w:rFonts w:ascii="Browallia New" w:eastAsia="Arial Unicode MS" w:hAnsi="Browallia New" w:cs="Browallia New"/>
@@ -3983,7 +3678,6 @@
         </w:rPr>
         <w:t>รออนุมัติ</w:t>
       </w:r>
-      <w:proofErr w:type="spellEnd"/>
       <w:r>
         <w:rPr>
           <w:rFonts w:eastAsia="Arial Unicode MS"/>
@@ -4007,103 +3701,77 @@
           <w:between w:val="nil"/>
         </w:pBdr>
       </w:pPr>
-      <w:proofErr w:type="spellStart"/>
       <w:r>
         <w:rPr>
           <w:rFonts w:ascii="Browallia New" w:eastAsia="Arial Unicode MS" w:hAnsi="Browallia New" w:cs="Browallia New"/>
         </w:rPr>
         <w:t>สำหรับเอกสารที่เข้าเงื่อนไข</w:t>
       </w:r>
-      <w:proofErr w:type="spellEnd"/>
       <w:r>
         <w:rPr>
           <w:rFonts w:eastAsia="Arial Unicode MS"/>
         </w:rPr>
         <w:t xml:space="preserve"> Maker-Checker (</w:t>
       </w:r>
-      <w:proofErr w:type="spellStart"/>
       <w:r>
         <w:rPr>
           <w:rFonts w:ascii="Browallia New" w:eastAsia="Arial Unicode MS" w:hAnsi="Browallia New" w:cs="Browallia New"/>
         </w:rPr>
         <w:t>เช่น</w:t>
       </w:r>
-      <w:proofErr w:type="spellEnd"/>
-      <w:r>
-        <w:rPr>
-          <w:rFonts w:eastAsia="Arial Unicode MS"/>
-        </w:rPr>
-        <w:t xml:space="preserve"> </w:t>
-      </w:r>
-      <w:proofErr w:type="spellStart"/>
+      <w:r>
+        <w:rPr>
+          <w:rFonts w:eastAsia="Arial Unicode MS"/>
+        </w:rPr>
+        <w:t xml:space="preserve"> </w:t>
+      </w:r>
       <w:r>
         <w:rPr>
           <w:rFonts w:ascii="Browallia New" w:eastAsia="Arial Unicode MS" w:hAnsi="Browallia New" w:cs="Browallia New"/>
         </w:rPr>
         <w:t>บิลค่าใช้จ่ายยอดเกิน</w:t>
       </w:r>
-      <w:proofErr w:type="spellEnd"/>
       <w:r>
         <w:rPr>
           <w:rFonts w:eastAsia="Arial Unicode MS"/>
         </w:rPr>
         <w:t xml:space="preserve"> 5,000 </w:t>
       </w:r>
-      <w:proofErr w:type="spellStart"/>
       <w:r>
         <w:rPr>
           <w:rFonts w:ascii="Browallia New" w:eastAsia="Arial Unicode MS" w:hAnsi="Browallia New" w:cs="Browallia New"/>
         </w:rPr>
         <w:t>บาท</w:t>
       </w:r>
-      <w:proofErr w:type="spellEnd"/>
       <w:r>
         <w:rPr>
           <w:rFonts w:eastAsia="Arial Unicode MS"/>
         </w:rPr>
         <w:t xml:space="preserve">) </w:t>
       </w:r>
-      <w:proofErr w:type="spellStart"/>
       <w:r>
         <w:rPr>
           <w:rFonts w:ascii="Browallia New" w:eastAsia="Arial Unicode MS" w:hAnsi="Browallia New" w:cs="Browallia New"/>
         </w:rPr>
         <w:t>สถานะหลักจะยังคงเป็น</w:t>
       </w:r>
-      <w:proofErr w:type="spellEnd"/>
       <w:r>
         <w:rPr>
           <w:rFonts w:eastAsia="Arial Unicode MS"/>
         </w:rPr>
         <w:t xml:space="preserve"> DRAFT </w:t>
       </w:r>
-      <w:proofErr w:type="spellStart"/>
       <w:r>
         <w:rPr>
           <w:rFonts w:ascii="Browallia New" w:eastAsia="Arial Unicode MS" w:hAnsi="Browallia New" w:cs="Browallia New"/>
         </w:rPr>
         <w:t>แต่มี</w:t>
       </w:r>
-      <w:proofErr w:type="spellEnd"/>
-      <w:r>
-        <w:rPr>
-          <w:rFonts w:eastAsia="Arial Unicode MS"/>
-        </w:rPr>
-        <w:t xml:space="preserve"> </w:t>
-      </w:r>
-      <w:proofErr w:type="spellStart"/>
-      <w:r>
-        <w:rPr>
-          <w:rFonts w:eastAsia="Arial Unicode MS"/>
-        </w:rPr>
-        <w:t>approval_status</w:t>
-      </w:r>
-      <w:proofErr w:type="spellEnd"/>
-      <w:r>
-        <w:rPr>
-          <w:rFonts w:eastAsia="Arial Unicode MS"/>
-        </w:rPr>
-        <w:t xml:space="preserve"> = 'PENDING'</w:t>
+      <w:r>
+        <w:rPr>
+          <w:rFonts w:eastAsia="Arial Unicode MS"/>
+        </w:rPr>
+        <w:t xml:space="preserve"> approval_status = 'PENDING'</w:t>
       </w:r>
     </w:p>
     <w:p>
@@ -4120,14 +3788,12 @@
           <w:between w:val="nil"/>
         </w:pBdr>
       </w:pPr>
-      <w:proofErr w:type="spellStart"/>
       <w:r>
         <w:rPr>
           <w:rFonts w:ascii="Browallia New" w:eastAsia="Arial Unicode MS" w:hAnsi="Browallia New" w:cs="Browallia New"/>
         </w:rPr>
         <w:t>ห้ามแก้ไขข้อมูลจนกว่าจะถูกตีกลับ</w:t>
       </w:r>
-      <w:proofErr w:type="spellEnd"/>
       <w:r>
         <w:rPr>
           <w:rFonts w:eastAsia="Arial Unicode MS"/>
@@ -4157,7 +3823,6 @@
         </w:rPr>
         <w:t>ISSUED (</w:t>
       </w:r>
-      <w:proofErr w:type="spellStart"/>
       <w:r>
         <w:rPr>
           <w:rFonts w:ascii="Browallia New" w:eastAsia="Arial Unicode MS" w:hAnsi="Browallia New" w:cs="Browallia New"/>
@@ -4166,7 +3831,6 @@
         </w:rPr>
         <w:t>ยืนยัน</w:t>
       </w:r>
-      <w:proofErr w:type="spellEnd"/>
       <w:r>
         <w:rPr>
           <w:rFonts w:eastAsia="Arial Unicode MS"/>
@@ -4175,7 +3839,6 @@
         </w:rPr>
         <w:t>/</w:t>
       </w:r>
-      <w:proofErr w:type="spellStart"/>
       <w:r>
         <w:rPr>
           <w:rFonts w:ascii="Browallia New" w:eastAsia="Arial Unicode MS" w:hAnsi="Browallia New" w:cs="Browallia New"/>
@@ -4184,7 +3847,6 @@
         </w:rPr>
         <w:t>ออกเอกสารแล้ว</w:t>
       </w:r>
-      <w:proofErr w:type="spellEnd"/>
       <w:r>
         <w:rPr>
           <w:rFonts w:eastAsia="Arial Unicode MS"/>
@@ -4208,49 +3870,42 @@
           <w:between w:val="nil"/>
         </w:pBdr>
       </w:pPr>
-      <w:proofErr w:type="spellStart"/>
       <w:r>
         <w:rPr>
           <w:rFonts w:ascii="Browallia New" w:eastAsia="Arial Unicode MS" w:hAnsi="Browallia New" w:cs="Browallia New"/>
         </w:rPr>
         <w:t>เมื่อกดยืนยัน</w:t>
       </w:r>
-      <w:proofErr w:type="spellEnd"/>
-      <w:r>
-        <w:rPr>
-          <w:rFonts w:eastAsia="Arial Unicode MS"/>
-        </w:rPr>
-        <w:t xml:space="preserve"> </w:t>
-      </w:r>
-      <w:proofErr w:type="spellStart"/>
+      <w:r>
+        <w:rPr>
+          <w:rFonts w:eastAsia="Arial Unicode MS"/>
+        </w:rPr>
+        <w:t xml:space="preserve"> </w:t>
+      </w:r>
       <w:r>
         <w:rPr>
           <w:rFonts w:ascii="Browallia New" w:eastAsia="Arial Unicode MS" w:hAnsi="Browallia New" w:cs="Browallia New"/>
         </w:rPr>
         <w:t>หรืออนุมัติผ่าน</w:t>
       </w:r>
-      <w:proofErr w:type="spellEnd"/>
-      <w:r>
-        <w:rPr>
-          <w:rFonts w:eastAsia="Arial Unicode MS"/>
-        </w:rPr>
-        <w:t xml:space="preserve"> </w:t>
-      </w:r>
-      <w:proofErr w:type="spellStart"/>
+      <w:r>
+        <w:rPr>
+          <w:rFonts w:eastAsia="Arial Unicode MS"/>
+        </w:rPr>
+        <w:t xml:space="preserve"> </w:t>
+      </w:r>
       <w:r>
         <w:rPr>
           <w:rFonts w:ascii="Browallia New" w:eastAsia="Arial Unicode MS" w:hAnsi="Browallia New" w:cs="Browallia New"/>
         </w:rPr>
         <w:t>ระบบจะทำการ</w:t>
       </w:r>
-      <w:proofErr w:type="spellEnd"/>
-      <w:r>
-        <w:rPr>
-          <w:rFonts w:eastAsia="Arial Unicode MS"/>
-        </w:rPr>
-        <w:t xml:space="preserve"> </w:t>
-      </w:r>
-      <w:proofErr w:type="spellStart"/>
+      <w:r>
+        <w:rPr>
+          <w:rFonts w:eastAsia="Arial Unicode MS"/>
+        </w:rPr>
+        <w:t xml:space="preserve"> </w:t>
+      </w:r>
       <w:r>
         <w:rPr>
           <w:rFonts w:ascii="Browallia New" w:eastAsia="Arial Unicode MS" w:hAnsi="Browallia New" w:cs="Browallia New"/>
@@ -4259,7 +3914,6 @@
         </w:rPr>
         <w:t>รันเลขที่เอกสารจริง</w:t>
       </w:r>
-      <w:proofErr w:type="spellEnd"/>
       <w:r>
         <w:rPr>
           <w:rFonts w:eastAsia="Arial Unicode MS"/>
@@ -4268,7 +3922,6 @@
         </w:rPr>
         <w:t xml:space="preserve"> (Running Number) </w:t>
       </w:r>
-      <w:proofErr w:type="spellStart"/>
       <w:r>
         <w:rPr>
           <w:rFonts w:ascii="Browallia New" w:eastAsia="Arial Unicode MS" w:hAnsi="Browallia New" w:cs="Browallia New"/>
@@ -4277,7 +3930,6 @@
         </w:rPr>
         <w:t>ผ่าน</w:t>
       </w:r>
-      <w:proofErr w:type="spellEnd"/>
       <w:r>
         <w:rPr>
           <w:rFonts w:eastAsia="Arial Unicode MS"/>
@@ -4286,7 +3938,6 @@
         </w:rPr>
         <w:t xml:space="preserve"> RPC </w:t>
       </w:r>
-      <w:proofErr w:type="spellStart"/>
       <w:r>
         <w:rPr>
           <w:rFonts w:ascii="Browallia New" w:eastAsia="Arial Unicode MS" w:hAnsi="Browallia New" w:cs="Browallia New"/>
@@ -4295,7 +3946,6 @@
         </w:rPr>
         <w:t>แบบ</w:t>
       </w:r>
-      <w:proofErr w:type="spellEnd"/>
       <w:r>
         <w:rPr>
           <w:rFonts w:eastAsia="Arial Unicode MS"/>
@@ -4310,28 +3960,24 @@
         </w:rPr>
         <w:t xml:space="preserve"> </w:t>
       </w:r>
-      <w:proofErr w:type="spellStart"/>
       <w:r>
         <w:rPr>
           <w:rFonts w:ascii="Browallia New" w:eastAsia="Arial Unicode MS" w:hAnsi="Browallia New" w:cs="Browallia New"/>
         </w:rPr>
         <w:t>อัตโนมัติ</w:t>
       </w:r>
-      <w:proofErr w:type="spellEnd"/>
-      <w:r>
-        <w:rPr>
-          <w:rFonts w:eastAsia="Arial Unicode MS"/>
-        </w:rPr>
-        <w:t xml:space="preserve"> </w:t>
-      </w:r>
-      <w:proofErr w:type="spellStart"/>
+      <w:r>
+        <w:rPr>
+          <w:rFonts w:eastAsia="Arial Unicode MS"/>
+        </w:rPr>
+        <w:t xml:space="preserve"> </w:t>
+      </w:r>
       <w:r>
         <w:rPr>
           <w:rFonts w:ascii="Browallia New" w:eastAsia="Arial Unicode MS" w:hAnsi="Browallia New" w:cs="Browallia New"/>
         </w:rPr>
         <w:t>ป้องกันปัญหาเลขบิลกระโดดหรือซ้ำซ้อน</w:t>
       </w:r>
-      <w:proofErr w:type="spellEnd"/>
     </w:p>
     <w:p>
       <w:pPr>
@@ -4347,28 +3993,24 @@
           <w:between w:val="nil"/>
         </w:pBdr>
       </w:pPr>
-      <w:proofErr w:type="spellStart"/>
       <w:r>
         <w:rPr>
           <w:rFonts w:ascii="Browallia New" w:eastAsia="Arial Unicode MS" w:hAnsi="Browallia New" w:cs="Browallia New"/>
         </w:rPr>
         <w:t>ข้อมูลมีผลทางบัญชีและสต็อกทันที</w:t>
       </w:r>
-      <w:proofErr w:type="spellEnd"/>
       <w:r>
         <w:rPr>
           <w:rFonts w:eastAsia="Arial Unicode MS"/>
         </w:rPr>
         <w:t xml:space="preserve"> (</w:t>
       </w:r>
-      <w:proofErr w:type="spellStart"/>
       <w:r>
         <w:rPr>
           <w:rFonts w:ascii="Browallia New" w:eastAsia="Arial Unicode MS" w:hAnsi="Browallia New" w:cs="Browallia New"/>
         </w:rPr>
         <w:t>ตามประเภทเอกสาร</w:t>
       </w:r>
-      <w:proofErr w:type="spellEnd"/>
       <w:r>
         <w:rPr>
           <w:rFonts w:eastAsia="Arial Unicode MS"/>
@@ -4390,7 +4032,6 @@
           <w:between w:val="nil"/>
         </w:pBdr>
       </w:pPr>
-      <w:proofErr w:type="spellStart"/>
       <w:r>
         <w:rPr>
           <w:rFonts w:ascii="Browallia New" w:eastAsia="Arial Unicode MS" w:hAnsi="Browallia New" w:cs="Browallia New"/>
@@ -4399,7 +4040,6 @@
         </w:rPr>
         <w:t>ห้ามลบ</w:t>
       </w:r>
-      <w:proofErr w:type="spellEnd"/>
       <w:r>
         <w:rPr>
           <w:rFonts w:eastAsia="Arial Unicode MS"/>
@@ -4414,14 +4054,12 @@
         </w:rPr>
         <w:t xml:space="preserve"> </w:t>
       </w:r>
-      <w:proofErr w:type="spellStart"/>
       <w:r>
         <w:rPr>
           <w:rFonts w:ascii="Browallia New" w:eastAsia="Arial Unicode MS" w:hAnsi="Browallia New" w:cs="Browallia New"/>
         </w:rPr>
         <w:t>โดยเด็ดขาด</w:t>
       </w:r>
-      <w:proofErr w:type="spellEnd"/>
     </w:p>
     <w:p>
       <w:pPr>
@@ -4437,35 +4075,30 @@
           <w:between w:val="nil"/>
         </w:pBdr>
       </w:pPr>
-      <w:proofErr w:type="spellStart"/>
       <w:r>
         <w:rPr>
           <w:rFonts w:ascii="Browallia New" w:eastAsia="Arial Unicode MS" w:hAnsi="Browallia New" w:cs="Browallia New"/>
         </w:rPr>
         <w:t>หากข้อมูลผิดพลาด</w:t>
       </w:r>
-      <w:proofErr w:type="spellEnd"/>
-      <w:r>
-        <w:rPr>
-          <w:rFonts w:eastAsia="Arial Unicode MS"/>
-        </w:rPr>
-        <w:t xml:space="preserve"> </w:t>
-      </w:r>
-      <w:proofErr w:type="spellStart"/>
+      <w:r>
+        <w:rPr>
+          <w:rFonts w:eastAsia="Arial Unicode MS"/>
+        </w:rPr>
+        <w:t xml:space="preserve"> </w:t>
+      </w:r>
       <w:r>
         <w:rPr>
           <w:rFonts w:ascii="Browallia New" w:eastAsia="Arial Unicode MS" w:hAnsi="Browallia New" w:cs="Browallia New"/>
         </w:rPr>
         <w:t>ต้องใช้คำสั่ง</w:t>
       </w:r>
-      <w:proofErr w:type="spellEnd"/>
-      <w:r>
-        <w:rPr>
-          <w:rFonts w:eastAsia="Arial Unicode MS"/>
-        </w:rPr>
-        <w:t xml:space="preserve"> </w:t>
-      </w:r>
-      <w:proofErr w:type="spellStart"/>
+      <w:r>
+        <w:rPr>
+          <w:rFonts w:eastAsia="Arial Unicode MS"/>
+        </w:rPr>
+        <w:t xml:space="preserve"> </w:t>
+      </w:r>
       <w:r>
         <w:rPr>
           <w:rFonts w:ascii="Browallia New" w:eastAsia="Arial Unicode MS" w:hAnsi="Browallia New" w:cs="Browallia New"/>
@@ -4474,7 +4107,6 @@
         </w:rPr>
         <w:t>ยกเลิก</w:t>
       </w:r>
-      <w:proofErr w:type="spellEnd"/>
       <w:r>
         <w:rPr>
           <w:rFonts w:eastAsia="Arial Unicode MS"/>
@@ -4489,14 +4121,12 @@
         </w:rPr>
         <w:t xml:space="preserve"> </w:t>
       </w:r>
-      <w:proofErr w:type="spellStart"/>
       <w:r>
         <w:rPr>
           <w:rFonts w:ascii="Browallia New" w:eastAsia="Arial Unicode MS" w:hAnsi="Browallia New" w:cs="Browallia New"/>
         </w:rPr>
         <w:t>เท่านั้น</w:t>
       </w:r>
-      <w:proofErr w:type="spellEnd"/>
     </w:p>
     <w:p>
       <w:pPr>
@@ -4520,7 +4150,6 @@
         </w:rPr>
         <w:t>VOID (</w:t>
       </w:r>
-      <w:proofErr w:type="spellStart"/>
       <w:r>
         <w:rPr>
           <w:rFonts w:ascii="Browallia New" w:eastAsia="Arial Unicode MS" w:hAnsi="Browallia New" w:cs="Browallia New"/>
@@ -4529,7 +4158,6 @@
         </w:rPr>
         <w:t>ยกเลิกเอกสาร</w:t>
       </w:r>
-      <w:proofErr w:type="spellEnd"/>
       <w:r>
         <w:rPr>
           <w:rFonts w:eastAsia="Arial Unicode MS"/>
@@ -4553,21 +4181,18 @@
           <w:between w:val="nil"/>
         </w:pBdr>
       </w:pPr>
-      <w:proofErr w:type="spellStart"/>
       <w:r>
         <w:rPr>
           <w:rFonts w:ascii="Browallia New" w:eastAsia="Arial Unicode MS" w:hAnsi="Browallia New" w:cs="Browallia New"/>
         </w:rPr>
         <w:t>ระบบจะทำการ</w:t>
       </w:r>
-      <w:proofErr w:type="spellEnd"/>
-      <w:r>
-        <w:rPr>
-          <w:rFonts w:eastAsia="Arial Unicode MS"/>
-        </w:rPr>
-        <w:t xml:space="preserve"> </w:t>
-      </w:r>
-      <w:proofErr w:type="spellStart"/>
+      <w:r>
+        <w:rPr>
+          <w:rFonts w:eastAsia="Arial Unicode MS"/>
+        </w:rPr>
+        <w:t xml:space="preserve"> </w:t>
+      </w:r>
       <w:r>
         <w:rPr>
           <w:rFonts w:ascii="Browallia New" w:eastAsia="Arial Unicode MS" w:hAnsi="Browallia New" w:cs="Browallia New"/>
@@ -4576,7 +4201,6 @@
         </w:rPr>
         <w:t>คืนสต็อก</w:t>
       </w:r>
-      <w:proofErr w:type="spellEnd"/>
       <w:r>
         <w:rPr>
           <w:rFonts w:eastAsia="Arial Unicode MS"/>
@@ -4591,14 +4215,12 @@
         </w:rPr>
         <w:t xml:space="preserve"> </w:t>
       </w:r>
-      <w:proofErr w:type="spellStart"/>
       <w:r>
         <w:rPr>
           <w:rFonts w:ascii="Browallia New" w:eastAsia="Arial Unicode MS" w:hAnsi="Browallia New" w:cs="Browallia New"/>
         </w:rPr>
         <w:t>หรือคืนยอดหนี้ให้อัตโนมัติ</w:t>
       </w:r>
-      <w:proofErr w:type="spellEnd"/>
     </w:p>
     <w:p>
       <w:pPr>
@@ -4614,14 +4236,12 @@
           <w:between w:val="nil"/>
         </w:pBdr>
       </w:pPr>
-      <w:proofErr w:type="spellStart"/>
       <w:r>
         <w:rPr>
           <w:rFonts w:ascii="Browallia New" w:eastAsia="Arial Unicode MS" w:hAnsi="Browallia New" w:cs="Browallia New"/>
         </w:rPr>
         <w:t>เอกสารจะยังคงอยู่ในระบบเพื่อเก็บเป็น</w:t>
       </w:r>
-      <w:proofErr w:type="spellEnd"/>
       <w:r>
         <w:rPr>
           <w:rFonts w:eastAsia="Arial Unicode MS"/>
@@ -4643,84 +4263,72 @@
           <w:between w:val="nil"/>
         </w:pBdr>
       </w:pPr>
-      <w:proofErr w:type="spellStart"/>
       <w:r>
         <w:rPr>
           <w:rFonts w:ascii="Browallia New" w:eastAsia="Arial Unicode MS" w:hAnsi="Browallia New" w:cs="Browallia New"/>
         </w:rPr>
         <w:t>สามารถใช้ฟีเจอร์</w:t>
       </w:r>
-      <w:proofErr w:type="spellEnd"/>
       <w:r>
         <w:rPr>
           <w:rFonts w:eastAsia="Arial Unicode MS"/>
         </w:rPr>
         <w:t xml:space="preserve"> "</w:t>
       </w:r>
-      <w:proofErr w:type="spellStart"/>
       <w:r>
         <w:rPr>
           <w:rFonts w:ascii="Browallia New" w:eastAsia="Arial Unicode MS" w:hAnsi="Browallia New" w:cs="Browallia New"/>
         </w:rPr>
         <w:t>ออกเอกสารทดแทน</w:t>
       </w:r>
-      <w:proofErr w:type="spellEnd"/>
       <w:r>
         <w:rPr>
           <w:rFonts w:eastAsia="Arial Unicode MS"/>
         </w:rPr>
         <w:t xml:space="preserve"> (Cancel &amp; Replace)" </w:t>
       </w:r>
-      <w:proofErr w:type="spellStart"/>
       <w:r>
         <w:rPr>
           <w:rFonts w:ascii="Browallia New" w:eastAsia="Arial Unicode MS" w:hAnsi="Browallia New" w:cs="Browallia New"/>
         </w:rPr>
         <w:t>ระบบจะโคลนข้อมูลไปสร้างเป็น</w:t>
       </w:r>
-      <w:proofErr w:type="spellEnd"/>
       <w:r>
         <w:rPr>
           <w:rFonts w:eastAsia="Arial Unicode MS"/>
         </w:rPr>
         <w:t xml:space="preserve"> DRAFT </w:t>
       </w:r>
-      <w:proofErr w:type="spellStart"/>
       <w:r>
         <w:rPr>
           <w:rFonts w:ascii="Browallia New" w:eastAsia="Arial Unicode MS" w:hAnsi="Browallia New" w:cs="Browallia New"/>
         </w:rPr>
         <w:t>ใบใหม่</w:t>
       </w:r>
-      <w:proofErr w:type="spellEnd"/>
-      <w:r>
-        <w:rPr>
-          <w:rFonts w:eastAsia="Arial Unicode MS"/>
-        </w:rPr>
-        <w:t xml:space="preserve"> </w:t>
-      </w:r>
-      <w:proofErr w:type="spellStart"/>
+      <w:r>
+        <w:rPr>
+          <w:rFonts w:eastAsia="Arial Unicode MS"/>
+        </w:rPr>
+        <w:t xml:space="preserve"> </w:t>
+      </w:r>
       <w:r>
         <w:rPr>
           <w:rFonts w:ascii="Browallia New" w:eastAsia="Arial Unicode MS" w:hAnsi="Browallia New" w:cs="Browallia New"/>
         </w:rPr>
         <w:t>พร้อม</w:t>
       </w:r>
-      <w:proofErr w:type="spellEnd"/>
       <w:r>
         <w:rPr>
           <w:rFonts w:eastAsia="Arial Unicode MS"/>
         </w:rPr>
         <w:t xml:space="preserve"> Auto-Remark </w:t>
       </w:r>
-      <w:proofErr w:type="spellStart"/>
       <w:r>
         <w:rPr>
           <w:rFonts w:ascii="Browallia New" w:eastAsia="Arial Unicode MS" w:hAnsi="Browallia New" w:cs="Browallia New"/>
         </w:rPr>
         <w:t>อ้างอิงถึงบิลที่ถูกยกเลิก</w:t>
       </w:r>
-      <w:proofErr w:type="spellEnd"/>
       <w:r>
         <w:rPr>
           <w:rFonts w:eastAsia="Arial Unicode MS"/>
@@ -4750,7 +4358,6 @@
         </w:rPr>
         <w:t>PAID (</w:t>
       </w:r>
-      <w:proofErr w:type="spellStart"/>
       <w:r>
         <w:rPr>
           <w:rFonts w:ascii="Browallia New" w:eastAsia="Arial Unicode MS" w:hAnsi="Browallia New" w:cs="Browallia New"/>
@@ -4759,7 +4366,6 @@
         </w:rPr>
         <w:t>ชำระเงินแล้ว</w:t>
       </w:r>
-      <w:proofErr w:type="spellEnd"/>
       <w:r>
         <w:rPr>
           <w:rFonts w:eastAsia="Arial Unicode MS"/>
@@ -4783,42 +4389,36 @@
           <w:between w:val="nil"/>
         </w:pBdr>
       </w:pPr>
-      <w:proofErr w:type="spellStart"/>
       <w:r>
         <w:rPr>
           <w:rFonts w:ascii="Browallia New" w:eastAsia="Arial Unicode MS" w:hAnsi="Browallia New" w:cs="Browallia New"/>
         </w:rPr>
         <w:t>สถานะพิเศษสำหรับเอกสาร</w:t>
       </w:r>
-      <w:proofErr w:type="spellEnd"/>
       <w:r>
         <w:rPr>
           <w:rFonts w:eastAsia="Arial Unicode MS"/>
         </w:rPr>
         <w:t xml:space="preserve"> AP/AR </w:t>
       </w:r>
-      <w:proofErr w:type="spellStart"/>
       <w:r>
         <w:rPr>
           <w:rFonts w:ascii="Browallia New" w:eastAsia="Arial Unicode MS" w:hAnsi="Browallia New" w:cs="Browallia New"/>
         </w:rPr>
         <w:t>ที่มีการรับ</w:t>
       </w:r>
-      <w:proofErr w:type="spellEnd"/>
       <w:r>
         <w:rPr>
           <w:rFonts w:eastAsia="Arial Unicode MS"/>
         </w:rPr>
         <w:t>/</w:t>
       </w:r>
-      <w:proofErr w:type="spellStart"/>
       <w:r>
         <w:rPr>
           <w:rFonts w:ascii="Browallia New" w:eastAsia="Arial Unicode MS" w:hAnsi="Browallia New" w:cs="Browallia New"/>
         </w:rPr>
         <w:t>จ่ายชำระหนี้ครบถ้วนแล้ว</w:t>
       </w:r>
-      <w:proofErr w:type="spellEnd"/>
       <w:r>
         <w:rPr>
           <w:rFonts w:eastAsia="Arial Unicode MS"/>
@@ -4840,42 +4440,36 @@
           <w:between w:val="nil"/>
         </w:pBdr>
       </w:pPr>
-      <w:proofErr w:type="spellStart"/>
       <w:r>
         <w:rPr>
           <w:rFonts w:ascii="Browallia New" w:eastAsia="Arial Unicode MS" w:hAnsi="Browallia New" w:cs="Browallia New"/>
         </w:rPr>
         <w:t>สำหรับบิลซื้อเงินสด</w:t>
       </w:r>
-      <w:proofErr w:type="spellEnd"/>
       <w:r>
         <w:rPr>
           <w:rFonts w:eastAsia="Arial Unicode MS"/>
         </w:rPr>
         <w:t xml:space="preserve"> (AP_CASH) </w:t>
       </w:r>
-      <w:proofErr w:type="spellStart"/>
       <w:r>
         <w:rPr>
           <w:rFonts w:ascii="Browallia New" w:eastAsia="Arial Unicode MS" w:hAnsi="Browallia New" w:cs="Browallia New"/>
         </w:rPr>
         <w:t>ระบบจะวิ่งเข้าสถานะ</w:t>
       </w:r>
-      <w:proofErr w:type="spellEnd"/>
       <w:r>
         <w:rPr>
           <w:rFonts w:eastAsia="Arial Unicode MS"/>
         </w:rPr>
         <w:t xml:space="preserve"> PAID </w:t>
       </w:r>
-      <w:proofErr w:type="spellStart"/>
       <w:r>
         <w:rPr>
           <w:rFonts w:ascii="Browallia New" w:eastAsia="Arial Unicode MS" w:hAnsi="Browallia New" w:cs="Browallia New"/>
         </w:rPr>
         <w:t>อัตโนมัติเมื่อเอกสารถูก</w:t>
       </w:r>
-      <w:proofErr w:type="spellEnd"/>
       <w:r>
         <w:rPr>
           <w:rFonts w:eastAsia="Arial Unicode MS"/>
@@ -4893,14 +4487,12 @@
         </w:rPr>
         <w:t xml:space="preserve">3. </w:t>
       </w:r>
-      <w:proofErr w:type="spellStart"/>
       <w:r>
         <w:rPr>
           <w:rFonts w:ascii="Browallia New" w:eastAsia="Arial Unicode MS" w:hAnsi="Browallia New" w:cs="Browallia New"/>
         </w:rPr>
         <w:t>มาตรฐานการบันทึกบัญชีเพิ่มเติม</w:t>
       </w:r>
-      <w:proofErr w:type="spellEnd"/>
       <w:r>
         <w:rPr>
           <w:rFonts w:eastAsia="Arial Unicode MS"/>
@@ -4935,117 +4527,89 @@
         </w:rPr>
         <w:t xml:space="preserve"> </w:t>
       </w:r>
-      <w:proofErr w:type="spellStart"/>
       <w:r>
         <w:rPr>
           <w:rFonts w:ascii="Browallia New" w:eastAsia="Arial Unicode MS" w:hAnsi="Browallia New" w:cs="Browallia New"/>
         </w:rPr>
         <w:t>หน้าแสดงรายการเอกสาร</w:t>
       </w:r>
-      <w:proofErr w:type="spellEnd"/>
       <w:r>
         <w:rPr>
           <w:rFonts w:eastAsia="Arial Unicode MS"/>
         </w:rPr>
         <w:t xml:space="preserve"> (Document List) </w:t>
       </w:r>
-      <w:proofErr w:type="spellStart"/>
       <w:r>
         <w:rPr>
           <w:rFonts w:ascii="Browallia New" w:eastAsia="Arial Unicode MS" w:hAnsi="Browallia New" w:cs="Browallia New"/>
         </w:rPr>
         <w:t>จะต้องแสดงผลแบบ</w:t>
       </w:r>
-      <w:proofErr w:type="spellEnd"/>
       <w:r>
         <w:rPr>
           <w:rFonts w:eastAsia="Arial Unicode MS"/>
         </w:rPr>
         <w:t xml:space="preserve"> Real-time </w:t>
       </w:r>
-      <w:proofErr w:type="spellStart"/>
       <w:r>
         <w:rPr>
           <w:rFonts w:ascii="Browallia New" w:eastAsia="Arial Unicode MS" w:hAnsi="Browallia New" w:cs="Browallia New"/>
         </w:rPr>
         <w:t>เสมอ</w:t>
       </w:r>
-      <w:proofErr w:type="spellEnd"/>
-      <w:r>
-        <w:rPr>
-          <w:rFonts w:eastAsia="Arial Unicode MS"/>
-        </w:rPr>
-        <w:t xml:space="preserve"> </w:t>
-      </w:r>
-      <w:proofErr w:type="spellStart"/>
+      <w:r>
+        <w:rPr>
+          <w:rFonts w:eastAsia="Arial Unicode MS"/>
+        </w:rPr>
+        <w:t xml:space="preserve"> </w:t>
+      </w:r>
       <w:r>
         <w:rPr>
           <w:rFonts w:ascii="Browallia New" w:eastAsia="Arial Unicode MS" w:hAnsi="Browallia New" w:cs="Browallia New"/>
         </w:rPr>
         <w:t>ห้ามแสดงข้อมูลเก่า</w:t>
       </w:r>
-      <w:proofErr w:type="spellEnd"/>
       <w:r>
         <w:rPr>
           <w:rFonts w:eastAsia="Arial Unicode MS"/>
         </w:rPr>
         <w:t xml:space="preserve"> (Stale Data) </w:t>
       </w:r>
-      <w:proofErr w:type="spellStart"/>
       <w:r>
         <w:rPr>
           <w:rFonts w:ascii="Browallia New" w:eastAsia="Arial Unicode MS" w:hAnsi="Browallia New" w:cs="Browallia New"/>
         </w:rPr>
         <w:t>จาก</w:t>
       </w:r>
-      <w:proofErr w:type="spellEnd"/>
       <w:r>
         <w:rPr>
           <w:rFonts w:eastAsia="Arial Unicode MS"/>
         </w:rPr>
         <w:t xml:space="preserve"> Cache </w:t>
       </w:r>
-      <w:proofErr w:type="spellStart"/>
       <w:r>
         <w:rPr>
           <w:rFonts w:ascii="Browallia New" w:eastAsia="Arial Unicode MS" w:hAnsi="Browallia New" w:cs="Browallia New"/>
         </w:rPr>
         <w:t>ของ</w:t>
       </w:r>
-      <w:proofErr w:type="spellEnd"/>
       <w:r>
         <w:rPr>
           <w:rFonts w:eastAsia="Arial Unicode MS"/>
         </w:rPr>
         <w:t xml:space="preserve"> Next.js (</w:t>
       </w:r>
-      <w:proofErr w:type="spellStart"/>
       <w:r>
         <w:rPr>
           <w:rFonts w:ascii="Browallia New" w:eastAsia="Arial Unicode MS" w:hAnsi="Browallia New" w:cs="Browallia New"/>
         </w:rPr>
         <w:t>ใช้</w:t>
       </w:r>
-      <w:proofErr w:type="spellEnd"/>
-      <w:r>
-        <w:rPr>
-          <w:rFonts w:eastAsia="Arial Unicode MS"/>
-        </w:rPr>
-        <w:t xml:space="preserve"> </w:t>
-      </w:r>
-      <w:proofErr w:type="spellStart"/>
-      <w:r>
-        <w:rPr>
-          <w:rFonts w:eastAsia="Arial Unicode MS"/>
-        </w:rPr>
-        <w:t>revalidatePath</w:t>
-      </w:r>
-      <w:proofErr w:type="spellEnd"/>
-      <w:r>
-        <w:rPr>
-          <w:rFonts w:eastAsia="Arial Unicode MS"/>
-        </w:rPr>
-        <w:t>)</w:t>
+      <w:r>
+        <w:rPr>
+          <w:rFonts w:eastAsia="Arial Unicode MS"/>
+        </w:rPr>
+        <w:t xml:space="preserve"> revalidatePath)</w:t>
       </w:r>
     </w:p>
     <w:p>
@@ -5075,98 +4639,84 @@
         </w:rPr>
         <w:t xml:space="preserve"> </w:t>
       </w:r>
-      <w:proofErr w:type="spellStart"/>
       <w:r>
         <w:rPr>
           <w:rFonts w:ascii="Browallia New" w:eastAsia="Arial Unicode MS" w:hAnsi="Browallia New" w:cs="Browallia New"/>
         </w:rPr>
         <w:t>การแสดงผลรายงานทางบัญชี</w:t>
       </w:r>
-      <w:proofErr w:type="spellEnd"/>
-      <w:r>
-        <w:rPr>
-          <w:rFonts w:eastAsia="Arial Unicode MS"/>
-        </w:rPr>
-        <w:t xml:space="preserve"> </w:t>
-      </w:r>
-      <w:proofErr w:type="spellStart"/>
+      <w:r>
+        <w:rPr>
+          <w:rFonts w:eastAsia="Arial Unicode MS"/>
+        </w:rPr>
+        <w:t xml:space="preserve"> </w:t>
+      </w:r>
       <w:r>
         <w:rPr>
           <w:rFonts w:ascii="Browallia New" w:eastAsia="Arial Unicode MS" w:hAnsi="Browallia New" w:cs="Browallia New"/>
         </w:rPr>
         <w:t>ต้องยึดถือ</w:t>
       </w:r>
-      <w:proofErr w:type="spellEnd"/>
       <w:r>
         <w:rPr>
           <w:rFonts w:eastAsia="Arial Unicode MS"/>
         </w:rPr>
         <w:t xml:space="preserve"> "</w:t>
       </w:r>
-      <w:proofErr w:type="spellStart"/>
       <w:r>
         <w:rPr>
           <w:rFonts w:ascii="Browallia New" w:eastAsia="Arial Unicode MS" w:hAnsi="Browallia New" w:cs="Browallia New"/>
         </w:rPr>
         <w:t>วันที่บันทึกบัญชี</w:t>
       </w:r>
-      <w:proofErr w:type="spellEnd"/>
       <w:r>
         <w:rPr>
           <w:rFonts w:eastAsia="Arial Unicode MS"/>
         </w:rPr>
         <w:t xml:space="preserve"> (Posting Date / Created At)" </w:t>
       </w:r>
-      <w:proofErr w:type="spellStart"/>
       <w:r>
         <w:rPr>
           <w:rFonts w:ascii="Browallia New" w:eastAsia="Arial Unicode MS" w:hAnsi="Browallia New" w:cs="Browallia New"/>
         </w:rPr>
         <w:t>เป็นหลัก</w:t>
       </w:r>
-      <w:proofErr w:type="spellEnd"/>
-      <w:r>
-        <w:rPr>
-          <w:rFonts w:eastAsia="Arial Unicode MS"/>
-        </w:rPr>
-        <w:t xml:space="preserve"> </w:t>
-      </w:r>
-      <w:proofErr w:type="spellStart"/>
+      <w:r>
+        <w:rPr>
+          <w:rFonts w:eastAsia="Arial Unicode MS"/>
+        </w:rPr>
+        <w:t xml:space="preserve"> </w:t>
+      </w:r>
       <w:r>
         <w:rPr>
           <w:rFonts w:ascii="Browallia New" w:eastAsia="Arial Unicode MS" w:hAnsi="Browallia New" w:cs="Browallia New"/>
         </w:rPr>
         <w:t>ไม่ใช่</w:t>
       </w:r>
-      <w:proofErr w:type="spellEnd"/>
       <w:r>
         <w:rPr>
           <w:rFonts w:eastAsia="Arial Unicode MS"/>
         </w:rPr>
         <w:t xml:space="preserve"> "</w:t>
       </w:r>
-      <w:proofErr w:type="spellStart"/>
       <w:r>
         <w:rPr>
           <w:rFonts w:ascii="Browallia New" w:eastAsia="Arial Unicode MS" w:hAnsi="Browallia New" w:cs="Browallia New"/>
         </w:rPr>
         <w:t>วันที่บนบิล</w:t>
       </w:r>
-      <w:proofErr w:type="spellEnd"/>
       <w:r>
         <w:rPr>
           <w:rFonts w:eastAsia="Arial Unicode MS"/>
         </w:rPr>
         <w:t xml:space="preserve"> (Document Date)" </w:t>
       </w:r>
-      <w:proofErr w:type="spellStart"/>
       <w:r>
         <w:rPr>
           <w:rFonts w:ascii="Browallia New" w:eastAsia="Arial Unicode MS" w:hAnsi="Browallia New" w:cs="Browallia New"/>
         </w:rPr>
         <w:t>เพื่อให้ตรงตามหลักการบัญชีเกณฑ์คงค้าง</w:t>
       </w:r>
-      <w:proofErr w:type="spellEnd"/>
       <w:r>
         <w:rPr>
           <w:rFonts w:eastAsia="Arial Unicode MS"/>
@@ -5196,7 +4746,6 @@
         </w:rPr>
         <w:t>Cut-off Principle (</w:t>
       </w:r>
-      <w:proofErr w:type="spellStart"/>
       <w:r>
         <w:rPr>
           <w:rFonts w:ascii="Browallia New" w:eastAsia="Arial Unicode MS" w:hAnsi="Browallia New" w:cs="Browallia New"/>
@@ -5205,7 +4754,6 @@
         </w:rPr>
         <w:t>การปิดงวด</w:t>
       </w:r>
-      <w:proofErr w:type="spellEnd"/>
       <w:r>
         <w:rPr>
           <w:rFonts w:eastAsia="Arial Unicode MS"/>
@@ -5220,154 +4768,108 @@
         </w:rPr>
         <w:t xml:space="preserve"> </w:t>
       </w:r>
-      <w:proofErr w:type="spellStart"/>
       <w:r>
         <w:rPr>
           <w:rFonts w:ascii="Browallia New" w:eastAsia="Arial Unicode MS" w:hAnsi="Browallia New" w:cs="Browallia New"/>
         </w:rPr>
         <w:t>ระบบจะตรวจสอบ</w:t>
       </w:r>
-      <w:proofErr w:type="spellEnd"/>
-      <w:r>
-        <w:rPr>
-          <w:rFonts w:eastAsia="Arial Unicode MS"/>
-        </w:rPr>
-        <w:t xml:space="preserve"> </w:t>
-      </w:r>
-      <w:proofErr w:type="spellStart"/>
-      <w:r>
-        <w:rPr>
-          <w:rFonts w:eastAsia="Arial Unicode MS"/>
-        </w:rPr>
-        <w:t>doc_date</w:t>
-      </w:r>
-      <w:proofErr w:type="spellEnd"/>
-      <w:r>
-        <w:rPr>
-          <w:rFonts w:eastAsia="Arial Unicode MS"/>
-        </w:rPr>
-        <w:t xml:space="preserve"> </w:t>
-      </w:r>
-      <w:proofErr w:type="spellStart"/>
+      <w:r>
+        <w:rPr>
+          <w:rFonts w:eastAsia="Arial Unicode MS"/>
+        </w:rPr>
+        <w:t xml:space="preserve"> doc_date </w:t>
+      </w:r>
       <w:r>
         <w:rPr>
           <w:rFonts w:ascii="Browallia New" w:eastAsia="Arial Unicode MS" w:hAnsi="Browallia New" w:cs="Browallia New"/>
         </w:rPr>
         <w:t>กับตาราง</w:t>
       </w:r>
-      <w:proofErr w:type="spellEnd"/>
-      <w:r>
-        <w:rPr>
-          <w:rFonts w:eastAsia="Arial Unicode MS"/>
-        </w:rPr>
-        <w:t xml:space="preserve"> </w:t>
-      </w:r>
-      <w:proofErr w:type="spellStart"/>
-      <w:r>
-        <w:rPr>
-          <w:rFonts w:eastAsia="Arial Unicode MS"/>
-        </w:rPr>
-        <w:t>accounting_periods</w:t>
-      </w:r>
-      <w:proofErr w:type="spellEnd"/>
-      <w:r>
-        <w:rPr>
-          <w:rFonts w:eastAsia="Arial Unicode MS"/>
-        </w:rPr>
-        <w:t xml:space="preserve"> </w:t>
-      </w:r>
-      <w:proofErr w:type="spellStart"/>
+      <w:r>
+        <w:rPr>
+          <w:rFonts w:eastAsia="Arial Unicode MS"/>
+        </w:rPr>
+        <w:t xml:space="preserve"> accounting_periods </w:t>
+      </w:r>
       <w:r>
         <w:rPr>
           <w:rFonts w:ascii="Browallia New" w:eastAsia="Arial Unicode MS" w:hAnsi="Browallia New" w:cs="Browallia New"/>
         </w:rPr>
         <w:t>เสมอ</w:t>
       </w:r>
-      <w:proofErr w:type="spellEnd"/>
-      <w:r>
-        <w:rPr>
-          <w:rFonts w:eastAsia="Arial Unicode MS"/>
-        </w:rPr>
-        <w:t xml:space="preserve"> </w:t>
-      </w:r>
-      <w:proofErr w:type="spellStart"/>
+      <w:r>
+        <w:rPr>
+          <w:rFonts w:eastAsia="Arial Unicode MS"/>
+        </w:rPr>
+        <w:t xml:space="preserve"> </w:t>
+      </w:r>
       <w:r>
         <w:rPr>
           <w:rFonts w:ascii="Browallia New" w:eastAsia="Arial Unicode MS" w:hAnsi="Browallia New" w:cs="Browallia New"/>
         </w:rPr>
         <w:t>หากงวดบัญชีนั้นถูกตั้งสถานะเป็น</w:t>
       </w:r>
-      <w:proofErr w:type="spellEnd"/>
       <w:r>
         <w:rPr>
           <w:rFonts w:eastAsia="Arial Unicode MS"/>
         </w:rPr>
         <w:t xml:space="preserve"> CLOSED (Period Lock) </w:t>
       </w:r>
-      <w:proofErr w:type="spellStart"/>
       <w:r>
         <w:rPr>
           <w:rFonts w:ascii="Browallia New" w:eastAsia="Arial Unicode MS" w:hAnsi="Browallia New" w:cs="Browallia New"/>
         </w:rPr>
         <w:t>ระบบจะไม่อนุญาตให้สร้าง</w:t>
       </w:r>
-      <w:proofErr w:type="spellEnd"/>
       <w:r>
         <w:rPr>
           <w:rFonts w:eastAsia="Arial Unicode MS"/>
         </w:rPr>
         <w:t xml:space="preserve">, </w:t>
       </w:r>
-      <w:proofErr w:type="spellStart"/>
       <w:r>
         <w:rPr>
           <w:rFonts w:ascii="Browallia New" w:eastAsia="Arial Unicode MS" w:hAnsi="Browallia New" w:cs="Browallia New"/>
         </w:rPr>
         <w:t>แก้ไข</w:t>
       </w:r>
-      <w:proofErr w:type="spellEnd"/>
       <w:r>
         <w:rPr>
           <w:rFonts w:eastAsia="Arial Unicode MS"/>
         </w:rPr>
         <w:t xml:space="preserve">, </w:t>
       </w:r>
-      <w:proofErr w:type="spellStart"/>
       <w:r>
         <w:rPr>
           <w:rFonts w:ascii="Browallia New" w:eastAsia="Arial Unicode MS" w:hAnsi="Browallia New" w:cs="Browallia New"/>
         </w:rPr>
         <w:t>หรือ</w:t>
       </w:r>
-      <w:proofErr w:type="spellEnd"/>
       <w:r>
         <w:rPr>
           <w:rFonts w:eastAsia="Arial Unicode MS"/>
         </w:rPr>
         <w:t xml:space="preserve"> VOID </w:t>
       </w:r>
-      <w:proofErr w:type="spellStart"/>
       <w:r>
         <w:rPr>
           <w:rFonts w:ascii="Browallia New" w:eastAsia="Arial Unicode MS" w:hAnsi="Browallia New" w:cs="Browallia New"/>
         </w:rPr>
         <w:t>เอกสารในเดือนนั้นอีก</w:t>
       </w:r>
-      <w:proofErr w:type="spellEnd"/>
-      <w:r>
-        <w:rPr>
-          <w:rFonts w:eastAsia="Arial Unicode MS"/>
-        </w:rPr>
-        <w:t xml:space="preserve"> </w:t>
-      </w:r>
-      <w:proofErr w:type="spellStart"/>
+      <w:r>
+        <w:rPr>
+          <w:rFonts w:eastAsia="Arial Unicode MS"/>
+        </w:rPr>
+        <w:t xml:space="preserve"> </w:t>
+      </w:r>
       <w:r>
         <w:rPr>
           <w:rFonts w:ascii="Browallia New" w:eastAsia="Arial Unicode MS" w:hAnsi="Browallia New" w:cs="Browallia New"/>
         </w:rPr>
         <w:t>เพื่อรักษายอดคงเหลือไม่ให้คลาดเคลื่อนจากการนำส่งภาษีสรรพากร</w:t>
       </w:r>
-      <w:proofErr w:type="spellEnd"/>
     </w:p>
     <w:p>
       <w:pPr>
@@ -5391,7 +4893,6 @@
         </w:rPr>
         <w:t>Net Profit Engine (</w:t>
       </w:r>
-      <w:proofErr w:type="spellStart"/>
       <w:r>
         <w:rPr>
           <w:rFonts w:ascii="Browallia New" w:eastAsia="Arial Unicode MS" w:hAnsi="Browallia New" w:cs="Browallia New"/>
@@ -5400,7 +4901,6 @@
         </w:rPr>
         <w:t>กำไรสุทธิ</w:t>
       </w:r>
-      <w:proofErr w:type="spellEnd"/>
       <w:r>
         <w:rPr>
           <w:rFonts w:eastAsia="Arial Unicode MS"/>
@@ -5415,210 +4915,180 @@
         </w:rPr>
         <w:t xml:space="preserve"> </w:t>
       </w:r>
-      <w:proofErr w:type="spellStart"/>
       <w:r>
         <w:rPr>
           <w:rFonts w:ascii="Browallia New" w:eastAsia="Arial Unicode MS" w:hAnsi="Browallia New" w:cs="Browallia New"/>
         </w:rPr>
         <w:t>ระบบคำนวณกำไรจะนำ</w:t>
       </w:r>
-      <w:proofErr w:type="spellEnd"/>
       <w:r>
         <w:rPr>
           <w:rFonts w:eastAsia="Arial Unicode MS"/>
         </w:rPr>
         <w:t xml:space="preserve"> "</w:t>
       </w:r>
-      <w:proofErr w:type="spellStart"/>
       <w:r>
         <w:rPr>
           <w:rFonts w:ascii="Browallia New" w:eastAsia="Arial Unicode MS" w:hAnsi="Browallia New" w:cs="Browallia New"/>
         </w:rPr>
         <w:t>ยอดขายสุทธิ</w:t>
       </w:r>
-      <w:proofErr w:type="spellEnd"/>
       <w:r>
         <w:rPr>
           <w:rFonts w:eastAsia="Arial Unicode MS"/>
         </w:rPr>
         <w:t xml:space="preserve">" </w:t>
       </w:r>
-      <w:proofErr w:type="spellStart"/>
       <w:r>
         <w:rPr>
           <w:rFonts w:ascii="Browallia New" w:eastAsia="Arial Unicode MS" w:hAnsi="Browallia New" w:cs="Browallia New"/>
         </w:rPr>
         <w:t>หักลบด้วย</w:t>
       </w:r>
-      <w:proofErr w:type="spellEnd"/>
       <w:r>
         <w:rPr>
           <w:rFonts w:eastAsia="Arial Unicode MS"/>
         </w:rPr>
         <w:t xml:space="preserve"> "</w:t>
       </w:r>
-      <w:proofErr w:type="spellStart"/>
       <w:r>
         <w:rPr>
           <w:rFonts w:ascii="Browallia New" w:eastAsia="Arial Unicode MS" w:hAnsi="Browallia New" w:cs="Browallia New"/>
         </w:rPr>
         <w:t>ต้นทุนสินค้า</w:t>
       </w:r>
-      <w:proofErr w:type="spellEnd"/>
       <w:r>
         <w:rPr>
           <w:rFonts w:eastAsia="Arial Unicode MS"/>
         </w:rPr>
         <w:t xml:space="preserve"> (Product COGS) + </w:t>
       </w:r>
-      <w:proofErr w:type="spellStart"/>
       <w:r>
         <w:rPr>
           <w:rFonts w:ascii="Browallia New" w:eastAsia="Arial Unicode MS" w:hAnsi="Browallia New" w:cs="Browallia New"/>
         </w:rPr>
         <w:t>ค่าแรงช่าง</w:t>
       </w:r>
-      <w:proofErr w:type="spellEnd"/>
       <w:r>
         <w:rPr>
           <w:rFonts w:eastAsia="Arial Unicode MS"/>
         </w:rPr>
         <w:t xml:space="preserve"> (Wage COGS)" </w:t>
       </w:r>
-      <w:proofErr w:type="spellStart"/>
       <w:r>
         <w:rPr>
           <w:rFonts w:ascii="Browallia New" w:eastAsia="Arial Unicode MS" w:hAnsi="Browallia New" w:cs="Browallia New"/>
         </w:rPr>
         <w:t>จะได้</w:t>
       </w:r>
-      <w:proofErr w:type="spellEnd"/>
       <w:r>
         <w:rPr>
           <w:rFonts w:eastAsia="Arial Unicode MS"/>
         </w:rPr>
         <w:t xml:space="preserve"> "</w:t>
       </w:r>
-      <w:proofErr w:type="spellStart"/>
       <w:r>
         <w:rPr>
           <w:rFonts w:ascii="Browallia New" w:eastAsia="Arial Unicode MS" w:hAnsi="Browallia New" w:cs="Browallia New"/>
         </w:rPr>
         <w:t>กำไรขั้นต้น</w:t>
       </w:r>
-      <w:proofErr w:type="spellEnd"/>
       <w:r>
         <w:rPr>
           <w:rFonts w:eastAsia="Arial Unicode MS"/>
         </w:rPr>
         <w:t xml:space="preserve"> (Gross Profit)" </w:t>
       </w:r>
-      <w:proofErr w:type="spellStart"/>
       <w:r>
         <w:rPr>
           <w:rFonts w:ascii="Browallia New" w:eastAsia="Arial Unicode MS" w:hAnsi="Browallia New" w:cs="Browallia New"/>
         </w:rPr>
         <w:t>จากนั้นจะนำไปหักลบกับ</w:t>
       </w:r>
-      <w:proofErr w:type="spellEnd"/>
       <w:r>
         <w:rPr>
           <w:rFonts w:eastAsia="Arial Unicode MS"/>
         </w:rPr>
         <w:t xml:space="preserve"> "</w:t>
       </w:r>
-      <w:proofErr w:type="spellStart"/>
       <w:r>
         <w:rPr>
           <w:rFonts w:ascii="Browallia New" w:eastAsia="Arial Unicode MS" w:hAnsi="Browallia New" w:cs="Browallia New"/>
         </w:rPr>
         <w:t>ค่าใช้จ่ายดำเนินงาน</w:t>
       </w:r>
-      <w:proofErr w:type="spellEnd"/>
       <w:r>
         <w:rPr>
           <w:rFonts w:eastAsia="Arial Unicode MS"/>
         </w:rPr>
         <w:t xml:space="preserve"> (OPEX) </w:t>
       </w:r>
-      <w:proofErr w:type="spellStart"/>
       <w:r>
         <w:rPr>
           <w:rFonts w:ascii="Browallia New" w:eastAsia="Arial Unicode MS" w:hAnsi="Browallia New" w:cs="Browallia New"/>
         </w:rPr>
         <w:t>จากบิล</w:t>
       </w:r>
-      <w:proofErr w:type="spellEnd"/>
       <w:r>
         <w:rPr>
           <w:rFonts w:eastAsia="Arial Unicode MS"/>
         </w:rPr>
         <w:t xml:space="preserve"> EXP </w:t>
       </w:r>
-      <w:proofErr w:type="spellStart"/>
       <w:r>
         <w:rPr>
           <w:rFonts w:ascii="Browallia New" w:eastAsia="Arial Unicode MS" w:hAnsi="Browallia New" w:cs="Browallia New"/>
         </w:rPr>
         <w:t>สถานะ</w:t>
       </w:r>
-      <w:proofErr w:type="spellEnd"/>
       <w:r>
         <w:rPr>
           <w:rFonts w:eastAsia="Arial Unicode MS"/>
         </w:rPr>
         <w:t xml:space="preserve"> ISSUED/PAID" </w:t>
       </w:r>
-      <w:proofErr w:type="spellStart"/>
       <w:r>
         <w:rPr>
           <w:rFonts w:ascii="Browallia New" w:eastAsia="Arial Unicode MS" w:hAnsi="Browallia New" w:cs="Browallia New"/>
         </w:rPr>
         <w:t>เพื่อแสดง</w:t>
       </w:r>
-      <w:proofErr w:type="spellEnd"/>
       <w:r>
         <w:rPr>
           <w:rFonts w:eastAsia="Arial Unicode MS"/>
         </w:rPr>
         <w:t xml:space="preserve"> "</w:t>
       </w:r>
-      <w:proofErr w:type="spellStart"/>
       <w:r>
         <w:rPr>
           <w:rFonts w:ascii="Browallia New" w:eastAsia="Arial Unicode MS" w:hAnsi="Browallia New" w:cs="Browallia New"/>
         </w:rPr>
         <w:t>กำไรสุทธิ</w:t>
       </w:r>
-      <w:proofErr w:type="spellEnd"/>
       <w:r>
         <w:rPr>
           <w:rFonts w:eastAsia="Arial Unicode MS"/>
         </w:rPr>
         <w:t xml:space="preserve"> (Net Profit)" </w:t>
       </w:r>
-      <w:proofErr w:type="spellStart"/>
       <w:r>
         <w:rPr>
           <w:rFonts w:ascii="Browallia New" w:eastAsia="Arial Unicode MS" w:hAnsi="Browallia New" w:cs="Browallia New"/>
         </w:rPr>
         <w:t>แบบ</w:t>
       </w:r>
-      <w:proofErr w:type="spellEnd"/>
       <w:r>
         <w:rPr>
           <w:rFonts w:eastAsia="Arial Unicode MS"/>
         </w:rPr>
         <w:t xml:space="preserve"> Real-time </w:t>
       </w:r>
-      <w:proofErr w:type="spellStart"/>
       <w:r>
         <w:rPr>
           <w:rFonts w:ascii="Browallia New" w:eastAsia="Arial Unicode MS" w:hAnsi="Browallia New" w:cs="Browallia New"/>
         </w:rPr>
         <w:t>บน</w:t>
       </w:r>
-      <w:proofErr w:type="spellEnd"/>
       <w:r>
         <w:rPr>
           <w:rFonts w:eastAsia="Arial Unicode MS"/>
@@ -5664,15 +5134,7 @@
         <w:t xml:space="preserve"> (</w:t>
       </w:r>
       <w:r>
-        <w:t xml:space="preserve">ABAC &amp; </w:t>
-      </w:r>
-      <w:proofErr w:type="spellStart"/>
-      <w:r>
-        <w:t>DoA</w:t>
-      </w:r>
-      <w:proofErr w:type="spellEnd"/>
-      <w:r>
-        <w:t xml:space="preserve"> Matrix)</w:t>
+        <w:t>ABAC &amp; DoA Matrix)</w:t>
       </w:r>
     </w:p>
     <w:p>
@@ -5714,13 +5176,8 @@
         </w:rPr>
         <w:t xml:space="preserve"> (</w:t>
       </w:r>
-      <w:proofErr w:type="spellStart"/>
-      <w:r>
-        <w:t>SoD</w:t>
-      </w:r>
-      <w:proofErr w:type="spellEnd"/>
-      <w:r>
-        <w:t xml:space="preserve"> - Segregation of Duties) </w:t>
+      <w:r>
+        <w:t xml:space="preserve">SoD - Segregation of Duties) </w:t>
       </w:r>
       <w:r>
         <w:rPr>
@@ -5779,15 +5236,7 @@
         <w:t xml:space="preserve"> (</w:t>
       </w:r>
       <w:r>
-        <w:t>`</w:t>
-      </w:r>
-      <w:proofErr w:type="spellStart"/>
-      <w:r>
-        <w:t>created_by</w:t>
-      </w:r>
-      <w:proofErr w:type="spellEnd"/>
-      <w:r>
-        <w:t xml:space="preserve">`) </w:t>
+        <w:t xml:space="preserve">`created_by`) </w:t>
       </w:r>
       <w:r>
         <w:rPr>
@@ -5882,15 +5331,7 @@
         <w:t xml:space="preserve"> </w:t>
       </w:r>
       <w:r>
-        <w:t>`</w:t>
-      </w:r>
-      <w:proofErr w:type="spellStart"/>
-      <w:r>
-        <w:t>accessible_modules</w:t>
-      </w:r>
-      <w:proofErr w:type="spellEnd"/>
-      <w:r>
-        <w:t xml:space="preserve">` (JSONB) </w:t>
+        <w:t xml:space="preserve">`accessible_modules` (JSONB) </w:t>
       </w:r>
       <w:r>
         <w:rPr>
@@ -5906,15 +5347,7 @@
         <w:t xml:space="preserve"> </w:t>
       </w:r>
       <w:r>
-        <w:t>`</w:t>
-      </w:r>
-      <w:proofErr w:type="spellStart"/>
-      <w:r>
-        <w:t>app_roles</w:t>
-      </w:r>
-      <w:proofErr w:type="spellEnd"/>
-      <w:r>
-        <w:t>`</w:t>
+        <w:t>`app_roles`</w:t>
       </w:r>
     </w:p>
     <w:p>
@@ -5928,15 +5361,7 @@
         </w:pBdr>
       </w:pPr>
       <w:r>
-        <w:t>- Approval Limits (</w:t>
-      </w:r>
-      <w:proofErr w:type="spellStart"/>
-      <w:r>
-        <w:t>DoA</w:t>
-      </w:r>
-      <w:proofErr w:type="spellEnd"/>
-      <w:r>
-        <w:t xml:space="preserve">): </w:t>
+        <w:t xml:space="preserve">- Approval Limits (DoA): </w:t>
       </w:r>
       <w:r>
         <w:rPr>
@@ -5968,15 +5393,7 @@
         <w:t xml:space="preserve"> </w:t>
       </w:r>
       <w:r>
-        <w:t>`</w:t>
-      </w:r>
-      <w:proofErr w:type="spellStart"/>
-      <w:r>
-        <w:t>approval_limit</w:t>
-      </w:r>
-      <w:proofErr w:type="spellEnd"/>
-      <w:r>
-        <w:t xml:space="preserve">` </w:t>
+        <w:t xml:space="preserve">`approval_limit` </w:t>
       </w:r>
       <w:r>
         <w:rPr>
@@ -5992,15 +5409,7 @@
         <w:t xml:space="preserve"> </w:t>
       </w:r>
       <w:r>
-        <w:t>`</w:t>
-      </w:r>
-      <w:proofErr w:type="spellStart"/>
-      <w:r>
-        <w:t>user_profiles</w:t>
-      </w:r>
-      <w:proofErr w:type="spellEnd"/>
-      <w:r>
-        <w:t xml:space="preserve">` </w:t>
+        <w:t xml:space="preserve">`user_profiles` </w:t>
       </w:r>
       <w:r>
         <w:rPr>
@@ -6260,13 +5669,8 @@
         </w:rPr>
         <w:t xml:space="preserve"> </w:t>
       </w:r>
-      <w:proofErr w:type="spellStart"/>
-      <w:r>
-        <w:t>freight_cost</w:t>
-      </w:r>
-      <w:proofErr w:type="spellEnd"/>
-      <w:r>
-        <w:t xml:space="preserve"> </w:t>
+      <w:r>
+        <w:t xml:space="preserve">freight_cost </w:t>
       </w:r>
       <w:r>
         <w:rPr>
@@ -6378,13 +5782,8 @@
         </w:rPr>
         <w:t xml:space="preserve"> </w:t>
       </w:r>
-      <w:proofErr w:type="spellStart"/>
-      <w:r>
-        <w:t>inventory_ledger</w:t>
-      </w:r>
-      <w:proofErr w:type="spellEnd"/>
-      <w:r>
-        <w:t xml:space="preserve"> </w:t>
+      <w:r>
+        <w:t xml:space="preserve">inventory_ledger </w:t>
       </w:r>
       <w:r>
         <w:rPr>
@@ -6786,103 +6185,79 @@
         </w:rPr>
         <w:t xml:space="preserve"> (</w:t>
       </w:r>
-      <w:proofErr w:type="spellStart"/>
       <w:r>
         <w:rPr>
           <w:rFonts w:cstheme="minorBidi"/>
         </w:rPr>
-        <w:t>sales_channel</w:t>
-      </w:r>
-      <w:proofErr w:type="spellEnd"/>
+        <w:t xml:space="preserve">sales_channel), </w:t>
+      </w:r>
+      <w:r>
+        <w:rPr>
+          <w:rFonts w:cs="Cordia New" w:hint="cs"/>
+          <w:cs/>
+        </w:rPr>
+        <w:t>เลขที่คำสั่งซื้อ</w:t>
+      </w:r>
+      <w:r>
+        <w:rPr>
+          <w:rFonts w:cs="Cordia New"/>
+          <w:cs/>
+        </w:rPr>
+        <w:t xml:space="preserve"> (</w:t>
+      </w:r>
       <w:r>
         <w:rPr>
           <w:rFonts w:cstheme="minorBidi"/>
         </w:rPr>
-        <w:t xml:space="preserve">), </w:t>
+        <w:t xml:space="preserve">ecommerce_order_no), </w:t>
       </w:r>
       <w:r>
         <w:rPr>
           <w:rFonts w:cs="Cordia New" w:hint="cs"/>
           <w:cs/>
         </w:rPr>
-        <w:t>เลขที่คำสั่งซื้อ</w:t>
+        <w:t>และ</w:t>
       </w:r>
       <w:r>
         <w:rPr>
           <w:rFonts w:cs="Cordia New"/>
           <w:cs/>
         </w:rPr>
+        <w:t xml:space="preserve"> </w:t>
+      </w:r>
+      <w:r>
+        <w:rPr>
+          <w:rFonts w:cs="Cordia New" w:hint="cs"/>
+          <w:cs/>
+        </w:rPr>
+        <w:t>ชื่อ</w:t>
+      </w:r>
+      <w:r>
+        <w:rPr>
+          <w:rFonts w:cs="Cordia New"/>
+          <w:cs/>
+        </w:rPr>
+        <w:t>-</w:t>
+      </w:r>
+      <w:r>
+        <w:rPr>
+          <w:rFonts w:cs="Cordia New" w:hint="cs"/>
+          <w:cs/>
+        </w:rPr>
+        <w:t>นามสกุลลูกค้าจริง</w:t>
+      </w:r>
+      <w:r>
+        <w:rPr>
+          <w:rFonts w:cs="Cordia New"/>
+          <w:cs/>
+        </w:rPr>
         <w:t xml:space="preserve"> (</w:t>
       </w:r>
-      <w:proofErr w:type="spellStart"/>
       <w:r>
         <w:rPr>
           <w:rFonts w:cstheme="minorBidi"/>
         </w:rPr>
-        <w:t>ecommerce_order_no</w:t>
-      </w:r>
-      <w:proofErr w:type="spellEnd"/>
-      <w:r>
-        <w:rPr>
-          <w:rFonts w:cstheme="minorBidi"/>
-        </w:rPr>
-        <w:t xml:space="preserve">), </w:t>
-      </w:r>
-      <w:r>
-        <w:rPr>
-          <w:rFonts w:cs="Cordia New" w:hint="cs"/>
-          <w:cs/>
-        </w:rPr>
-        <w:t>และ</w:t>
-      </w:r>
-      <w:r>
-        <w:rPr>
-          <w:rFonts w:cs="Cordia New"/>
-          <w:cs/>
-        </w:rPr>
-        <w:t xml:space="preserve"> </w:t>
-      </w:r>
-      <w:r>
-        <w:rPr>
-          <w:rFonts w:cs="Cordia New" w:hint="cs"/>
-          <w:cs/>
-        </w:rPr>
-        <w:t>ชื่อ</w:t>
-      </w:r>
-      <w:r>
-        <w:rPr>
-          <w:rFonts w:cs="Cordia New"/>
-          <w:cs/>
-        </w:rPr>
-        <w:t>-</w:t>
-      </w:r>
-      <w:r>
-        <w:rPr>
-          <w:rFonts w:cs="Cordia New" w:hint="cs"/>
-          <w:cs/>
-        </w:rPr>
-        <w:t>นามสกุลลูกค้าจริง</w:t>
-      </w:r>
-      <w:r>
-        <w:rPr>
-          <w:rFonts w:cs="Cordia New"/>
-          <w:cs/>
-        </w:rPr>
-        <w:t xml:space="preserve"> (</w:t>
-      </w:r>
-      <w:proofErr w:type="spellStart"/>
-      <w:r>
-        <w:rPr>
-          <w:rFonts w:cstheme="minorBidi"/>
-        </w:rPr>
-        <w:t>ecommerce_buyer_name</w:t>
-      </w:r>
-      <w:proofErr w:type="spellEnd"/>
-      <w:r>
-        <w:rPr>
-          <w:rFonts w:cstheme="minorBidi"/>
-        </w:rPr>
-        <w:t xml:space="preserve">) </w:t>
+        <w:t xml:space="preserve">ecommerce_buyer_name) </w:t>
       </w:r>
       <w:r>
         <w:rPr>
@@ -6902,6 +6277,667 @@
           <w:between w:val="nil"/>
         </w:pBdr>
         <w:rPr>
+          <w:rFonts w:cs="Cordia New"/>
+        </w:rPr>
+      </w:pPr>
+      <w:r>
+        <w:rPr>
+          <w:rFonts w:cs="Cordia New"/>
+          <w:cs/>
+        </w:rPr>
+        <w:t xml:space="preserve">- </w:t>
+      </w:r>
+      <w:r>
+        <w:rPr>
+          <w:rFonts w:cs="Cordia New" w:hint="cs"/>
+          <w:cs/>
+        </w:rPr>
+        <w:t>การรับรู้รายได้</w:t>
+      </w:r>
+      <w:r>
+        <w:rPr>
+          <w:rFonts w:cs="Cordia New"/>
+          <w:cs/>
+        </w:rPr>
+        <w:t xml:space="preserve"> (</w:t>
+      </w:r>
+      <w:r>
+        <w:rPr>
+          <w:rFonts w:cstheme="minorBidi"/>
+        </w:rPr>
+        <w:t xml:space="preserve">TFRS </w:t>
+      </w:r>
+      <w:r>
+        <w:rPr>
+          <w:rFonts w:cs="Cordia New"/>
+          <w:cs/>
+        </w:rPr>
+        <w:t xml:space="preserve">15): </w:t>
+      </w:r>
+      <w:r>
+        <w:rPr>
+          <w:rFonts w:cs="Cordia New" w:hint="cs"/>
+          <w:cs/>
+        </w:rPr>
+        <w:t>บังคับให้ออกบิลขายด้วยยอดรวมสินค้าเต็มจำนวน</w:t>
+      </w:r>
+      <w:r>
+        <w:rPr>
+          <w:rFonts w:cs="Cordia New"/>
+          <w:cs/>
+        </w:rPr>
+        <w:t xml:space="preserve"> (</w:t>
+      </w:r>
+      <w:r>
+        <w:rPr>
+          <w:rFonts w:cstheme="minorBidi"/>
+        </w:rPr>
+        <w:t xml:space="preserve">Gross Sales) </w:t>
+      </w:r>
+      <w:r>
+        <w:rPr>
+          <w:rFonts w:cs="Cordia New" w:hint="cs"/>
+          <w:cs/>
+        </w:rPr>
+        <w:t>ห้ามหักค่าธรรมเนียมแพลตฟอร์มออกจากบิลขายเด็ดขาด</w:t>
+      </w:r>
+      <w:r>
+        <w:rPr>
+          <w:rFonts w:cs="Cordia New"/>
+          <w:cs/>
+        </w:rPr>
+        <w:t xml:space="preserve"> </w:t>
+      </w:r>
+      <w:r>
+        <w:rPr>
+          <w:rFonts w:cs="Cordia New" w:hint="cs"/>
+          <w:cs/>
+        </w:rPr>
+        <w:t>ค่าธรรมเนียมหรือคอมมิชชันจะต้องถูกนำไปตั้งเป็นบิลค่าใช้จ่าย</w:t>
+      </w:r>
+      <w:r>
+        <w:rPr>
+          <w:rFonts w:cs="Cordia New"/>
+          <w:cs/>
+        </w:rPr>
+        <w:t xml:space="preserve"> (</w:t>
+      </w:r>
+      <w:r>
+        <w:rPr>
+          <w:rFonts w:cstheme="minorBidi"/>
+        </w:rPr>
+        <w:t xml:space="preserve">EXP) </w:t>
+      </w:r>
+      <w:r>
+        <w:rPr>
+          <w:rFonts w:cs="Cordia New" w:hint="cs"/>
+          <w:cs/>
+        </w:rPr>
+        <w:t>แยกต่างหาก</w:t>
+      </w:r>
+      <w:r>
+        <w:rPr>
+          <w:rFonts w:cs="Cordia New"/>
+          <w:cs/>
+        </w:rPr>
+        <w:t xml:space="preserve"> </w:t>
+      </w:r>
+      <w:r>
+        <w:rPr>
+          <w:rFonts w:cs="Cordia New" w:hint="cs"/>
+          <w:cs/>
+        </w:rPr>
+        <w:t>เพื่อความถูกต้องของการนำส่งภาษี</w:t>
+      </w:r>
+    </w:p>
+    <w:p>
+      <w:pPr>
+        <w:pBdr>
+          <w:top w:val="nil"/>
+          <w:left w:val="nil"/>
+          <w:bottom w:val="nil"/>
+          <w:right w:val="nil"/>
+          <w:between w:val="nil"/>
+        </w:pBdr>
+        <w:rPr>
+          <w:rFonts w:cs="Cordia New"/>
+        </w:rPr>
+      </w:pPr>
+    </w:p>
+    <w:p>
+      <w:pPr>
+        <w:pBdr>
+          <w:top w:val="nil"/>
+          <w:left w:val="nil"/>
+          <w:bottom w:val="nil"/>
+          <w:right w:val="nil"/>
+          <w:between w:val="nil"/>
+        </w:pBdr>
+        <w:rPr>
+          <w:rFonts w:cstheme="minorBidi"/>
+        </w:rPr>
+      </w:pPr>
+      <w:r>
+        <w:rPr>
+          <w:rFonts w:cs="Cordia New"/>
+          <w:cs/>
+        </w:rPr>
+        <w:t xml:space="preserve">7. </w:t>
+      </w:r>
+      <w:r>
+        <w:rPr>
+          <w:rFonts w:cs="Cordia New" w:hint="cs"/>
+          <w:cs/>
+        </w:rPr>
+        <w:t>มาตรฐานค่าขนส่ง</w:t>
+      </w:r>
+      <w:r>
+        <w:rPr>
+          <w:rFonts w:cs="Cordia New"/>
+          <w:cs/>
+        </w:rPr>
+        <w:t xml:space="preserve"> 2 </w:t>
+      </w:r>
+      <w:r>
+        <w:rPr>
+          <w:rFonts w:cs="Cordia New" w:hint="cs"/>
+          <w:cs/>
+        </w:rPr>
+        <w:t>ทิศทาง</w:t>
+      </w:r>
+      <w:r>
+        <w:rPr>
+          <w:rFonts w:cs="Cordia New"/>
+          <w:cs/>
+        </w:rPr>
+        <w:t xml:space="preserve"> (</w:t>
+      </w:r>
+      <w:r>
+        <w:rPr>
+          <w:rFonts w:cstheme="minorBidi"/>
+        </w:rPr>
+        <w:t xml:space="preserve">Dual-Freight Landed Cost) </w:t>
+      </w:r>
+      <w:r>
+        <w:rPr>
+          <w:rFonts w:cs="Cordia New" w:hint="cs"/>
+          <w:cs/>
+        </w:rPr>
+        <w:t>และการแปลงหน่วยนับจัดซื้อ</w:t>
+      </w:r>
+      <w:r>
+        <w:rPr>
+          <w:rFonts w:cs="Cordia New"/>
+          <w:cs/>
+        </w:rPr>
+        <w:t xml:space="preserve"> (</w:t>
+      </w:r>
+      <w:r>
+        <w:rPr>
+          <w:rFonts w:cstheme="minorBidi"/>
+        </w:rPr>
+        <w:t xml:space="preserve">TAS </w:t>
+      </w:r>
+      <w:r>
+        <w:rPr>
+          <w:rFonts w:cs="Cordia New"/>
+          <w:cs/>
+        </w:rPr>
+        <w:t>2</w:t>
+      </w:r>
+      <w:r>
+        <w:rPr>
+          <w:rFonts w:cstheme="minorBidi"/>
+        </w:rPr>
+        <w:t xml:space="preserve"> Compliance)</w:t>
+      </w:r>
+    </w:p>
+    <w:p>
+      <w:pPr>
+        <w:pBdr>
+          <w:top w:val="nil"/>
+          <w:left w:val="nil"/>
+          <w:bottom w:val="nil"/>
+          <w:right w:val="nil"/>
+          <w:between w:val="nil"/>
+        </w:pBdr>
+        <w:rPr>
+          <w:rFonts w:cstheme="minorBidi"/>
+        </w:rPr>
+      </w:pPr>
+      <w:r>
+        <w:rPr>
+          <w:rFonts w:cs="Cordia New"/>
+          <w:cs/>
+        </w:rPr>
+        <w:t xml:space="preserve">- </w:t>
+      </w:r>
+      <w:r>
+        <w:rPr>
+          <w:rFonts w:cs="Cordia New" w:hint="cs"/>
+          <w:cs/>
+        </w:rPr>
+        <w:t>การแยกค่าขนส่งต้นทางและปลายทาง</w:t>
+      </w:r>
+      <w:r>
+        <w:rPr>
+          <w:rFonts w:cs="Cordia New"/>
+          <w:cs/>
+        </w:rPr>
+        <w:t xml:space="preserve"> (</w:t>
+      </w:r>
+      <w:r>
+        <w:rPr>
+          <w:rFonts w:cstheme="minorBidi"/>
+        </w:rPr>
+        <w:t>Origin vs Destination Freight):</w:t>
+      </w:r>
+    </w:p>
+    <w:p>
+      <w:pPr>
+        <w:pBdr>
+          <w:top w:val="nil"/>
+          <w:left w:val="nil"/>
+          <w:bottom w:val="nil"/>
+          <w:right w:val="nil"/>
+          <w:between w:val="nil"/>
+        </w:pBdr>
+        <w:rPr>
+          <w:rFonts w:cstheme="minorBidi"/>
+        </w:rPr>
+      </w:pPr>
+      <w:r>
+        <w:rPr>
+          <w:rFonts w:cs="Cordia New"/>
+          <w:cs/>
+        </w:rPr>
+        <w:t xml:space="preserve">  1. </w:t>
+      </w:r>
+      <w:r>
+        <w:rPr>
+          <w:rFonts w:cs="Cordia New" w:hint="cs"/>
+          <w:cs/>
+        </w:rPr>
+        <w:t>ค่าขนส่งต้นทาง</w:t>
+      </w:r>
+      <w:r>
+        <w:rPr>
+          <w:rFonts w:cs="Cordia New"/>
+          <w:cs/>
+        </w:rPr>
+        <w:t xml:space="preserve"> (</w:t>
+      </w:r>
+      <w:r>
+        <w:rPr>
+          <w:rFonts w:cstheme="minorBidi"/>
+        </w:rPr>
+        <w:t xml:space="preserve">Origin Freight / freight_cost): </w:t>
+      </w:r>
+      <w:r>
+        <w:rPr>
+          <w:rFonts w:cs="Cordia New" w:hint="cs"/>
+          <w:cs/>
+        </w:rPr>
+        <w:t>ค่าขนส่งที่ผู้ขายสินค้าเรียกเก็บมาในใบแจ้งหนี้</w:t>
+      </w:r>
+      <w:r>
+        <w:rPr>
+          <w:rFonts w:cs="Cordia New"/>
+          <w:cs/>
+        </w:rPr>
+        <w:t>/</w:t>
+      </w:r>
+      <w:r>
+        <w:rPr>
+          <w:rFonts w:cs="Cordia New" w:hint="cs"/>
+          <w:cs/>
+        </w:rPr>
+        <w:t>ใบกำกับภาษีเดียวกัน</w:t>
+      </w:r>
+      <w:r>
+        <w:rPr>
+          <w:rFonts w:cs="Cordia New"/>
+          <w:cs/>
+        </w:rPr>
+        <w:t xml:space="preserve"> </w:t>
+      </w:r>
+      <w:r>
+        <w:rPr>
+          <w:rFonts w:cs="Cordia New" w:hint="cs"/>
+          <w:cs/>
+        </w:rPr>
+        <w:t>ระบบจะนำไปรวมคำนวณยอดเจ้าหนี้ผู้ขาย</w:t>
+      </w:r>
+      <w:r>
+        <w:rPr>
+          <w:rFonts w:cs="Cordia New"/>
+          <w:cs/>
+        </w:rPr>
+        <w:t xml:space="preserve"> (</w:t>
+      </w:r>
+      <w:r>
+        <w:rPr>
+          <w:rFonts w:cstheme="minorBidi"/>
+        </w:rPr>
+        <w:t xml:space="preserve">Vendor AP) </w:t>
+      </w:r>
+      <w:r>
+        <w:rPr>
+          <w:rFonts w:cs="Cordia New" w:hint="cs"/>
+          <w:cs/>
+        </w:rPr>
+        <w:t>ตามโหมดภาษีค่าขนส่ง</w:t>
+      </w:r>
+      <w:r>
+        <w:rPr>
+          <w:rFonts w:cs="Cordia New"/>
+          <w:cs/>
+        </w:rPr>
+        <w:t xml:space="preserve"> (</w:t>
+      </w:r>
+      <w:r>
+        <w:rPr>
+          <w:rFonts w:cstheme="minorBidi"/>
+        </w:rPr>
+        <w:t xml:space="preserve">INCLUDED_IN_TAX </w:t>
+      </w:r>
+      <w:r>
+        <w:rPr>
+          <w:rFonts w:cs="Cordia New" w:hint="cs"/>
+          <w:cs/>
+        </w:rPr>
+        <w:t>หรือ</w:t>
+      </w:r>
+      <w:r>
+        <w:rPr>
+          <w:rFonts w:cs="Cordia New"/>
+          <w:cs/>
+        </w:rPr>
+        <w:t xml:space="preserve"> </w:t>
+      </w:r>
+      <w:r>
+        <w:rPr>
+          <w:rFonts w:cstheme="minorBidi"/>
+        </w:rPr>
+        <w:t xml:space="preserve">SEPARATE_NON_VAT) </w:t>
+      </w:r>
+      <w:r>
+        <w:rPr>
+          <w:rFonts w:cs="Cordia New" w:hint="cs"/>
+          <w:cs/>
+        </w:rPr>
+        <w:t>และปันส่วนเข้าต้นทุนสินค้า</w:t>
+      </w:r>
+    </w:p>
+    <w:p>
+      <w:pPr>
+        <w:pBdr>
+          <w:top w:val="nil"/>
+          <w:left w:val="nil"/>
+          <w:bottom w:val="nil"/>
+          <w:right w:val="nil"/>
+          <w:between w:val="nil"/>
+        </w:pBdr>
+        <w:rPr>
+          <w:rFonts w:cstheme="minorBidi"/>
+        </w:rPr>
+      </w:pPr>
+      <w:r>
+        <w:rPr>
+          <w:rFonts w:cs="Cordia New"/>
+          <w:cs/>
+        </w:rPr>
+        <w:t xml:space="preserve">  2. </w:t>
+      </w:r>
+      <w:r>
+        <w:rPr>
+          <w:rFonts w:cs="Cordia New" w:hint="cs"/>
+          <w:cs/>
+        </w:rPr>
+        <w:t>ค่าขนส่งปลายทาง</w:t>
+      </w:r>
+      <w:r>
+        <w:rPr>
+          <w:rFonts w:cs="Cordia New"/>
+          <w:cs/>
+        </w:rPr>
+        <w:t xml:space="preserve"> (</w:t>
+      </w:r>
+      <w:r>
+        <w:rPr>
+          <w:rFonts w:cstheme="minorBidi"/>
+        </w:rPr>
+        <w:t xml:space="preserve">Destination Freight / dest_freight_cost): </w:t>
+      </w:r>
+      <w:r>
+        <w:rPr>
+          <w:rFonts w:cs="Cordia New" w:hint="cs"/>
+          <w:cs/>
+        </w:rPr>
+        <w:t>ค่าขนส่งที่กิจการจ่ายให้บริษัทขนส่งแยกต่างหาก</w:t>
+      </w:r>
+      <w:r>
+        <w:rPr>
+          <w:rFonts w:cs="Cordia New"/>
+          <w:cs/>
+        </w:rPr>
+        <w:t xml:space="preserve"> (</w:t>
+      </w:r>
+      <w:r>
+        <w:rPr>
+          <w:rFonts w:cs="Cordia New" w:hint="cs"/>
+          <w:cs/>
+        </w:rPr>
+        <w:t>ระบุผู้ขนส่งจากตาราง</w:t>
+      </w:r>
+      <w:r>
+        <w:rPr>
+          <w:rFonts w:cs="Cordia New"/>
+          <w:cs/>
+        </w:rPr>
+        <w:t xml:space="preserve"> </w:t>
+      </w:r>
+      <w:r>
+        <w:rPr>
+          <w:rFonts w:cstheme="minorBidi"/>
+        </w:rPr>
+        <w:t xml:space="preserve">mst_carriers) </w:t>
+      </w:r>
+      <w:r>
+        <w:rPr>
+          <w:rFonts w:cs="Cordia New" w:hint="cs"/>
+          <w:cs/>
+        </w:rPr>
+        <w:t>ระบบจะนำมารวมปันส่วนเป็นต้นทุนสินค้าเข้าคลัง</w:t>
+      </w:r>
+      <w:r>
+        <w:rPr>
+          <w:rFonts w:cs="Cordia New"/>
+          <w:cs/>
+        </w:rPr>
+        <w:t xml:space="preserve"> (</w:t>
+      </w:r>
+      <w:r>
+        <w:rPr>
+          <w:rFonts w:cstheme="minorBidi"/>
+        </w:rPr>
+        <w:t xml:space="preserve">Landed Cost </w:t>
+      </w:r>
+      <w:r>
+        <w:rPr>
+          <w:rFonts w:cs="Cordia New" w:hint="cs"/>
+          <w:cs/>
+        </w:rPr>
+        <w:t>ตามมาตรฐาน</w:t>
+      </w:r>
+      <w:r>
+        <w:rPr>
+          <w:rFonts w:cs="Cordia New"/>
+          <w:cs/>
+        </w:rPr>
+        <w:t xml:space="preserve"> </w:t>
+      </w:r>
+      <w:r>
+        <w:rPr>
+          <w:rFonts w:cstheme="minorBidi"/>
+        </w:rPr>
+        <w:t xml:space="preserve">TAS </w:t>
+      </w:r>
+      <w:r>
+        <w:rPr>
+          <w:rFonts w:cs="Cordia New"/>
+          <w:cs/>
+        </w:rPr>
+        <w:t xml:space="preserve">2) </w:t>
+      </w:r>
+      <w:r>
+        <w:rPr>
+          <w:rFonts w:cs="Cordia New" w:hint="cs"/>
+          <w:cs/>
+        </w:rPr>
+        <w:t>แต่ห้ามนำไปรวมในยอดเจ้าหนี้ของผู้ขายสินค้า</w:t>
+      </w:r>
+      <w:r>
+        <w:rPr>
+          <w:rFonts w:cs="Cordia New"/>
+          <w:cs/>
+        </w:rPr>
+        <w:t xml:space="preserve"> (</w:t>
+      </w:r>
+      <w:r>
+        <w:rPr>
+          <w:rFonts w:cstheme="minorBidi"/>
+        </w:rPr>
+        <w:t xml:space="preserve">Vendor AP) </w:t>
+      </w:r>
+      <w:r>
+        <w:rPr>
+          <w:rFonts w:cs="Cordia New" w:hint="cs"/>
+          <w:cs/>
+        </w:rPr>
+        <w:t>โดยเด็ดขาด</w:t>
+      </w:r>
+      <w:r>
+        <w:rPr>
+          <w:rFonts w:cs="Cordia New"/>
+          <w:cs/>
+        </w:rPr>
+        <w:t xml:space="preserve"> </w:t>
+      </w:r>
+      <w:r>
+        <w:rPr>
+          <w:rFonts w:cs="Cordia New" w:hint="cs"/>
+          <w:cs/>
+        </w:rPr>
+        <w:t>และระบบจะคำนวณภาษีหัก</w:t>
+      </w:r>
+      <w:r>
+        <w:rPr>
+          <w:rFonts w:cs="Cordia New"/>
+          <w:cs/>
+        </w:rPr>
+        <w:t xml:space="preserve"> </w:t>
+      </w:r>
+      <w:r>
+        <w:rPr>
+          <w:rFonts w:cs="Cordia New" w:hint="cs"/>
+          <w:cs/>
+        </w:rPr>
+        <w:t>ณ</w:t>
+      </w:r>
+      <w:r>
+        <w:rPr>
+          <w:rFonts w:cs="Cordia New"/>
+          <w:cs/>
+        </w:rPr>
+        <w:t xml:space="preserve"> </w:t>
+      </w:r>
+      <w:r>
+        <w:rPr>
+          <w:rFonts w:cs="Cordia New" w:hint="cs"/>
+          <w:cs/>
+        </w:rPr>
+        <w:t>ที่จ่ายค่าขนส่ง</w:t>
+      </w:r>
+      <w:r>
+        <w:rPr>
+          <w:rFonts w:cs="Cordia New"/>
+          <w:cs/>
+        </w:rPr>
+        <w:t xml:space="preserve"> 1% </w:t>
+      </w:r>
+      <w:r>
+        <w:rPr>
+          <w:rFonts w:cs="Cordia New" w:hint="cs"/>
+          <w:cs/>
+        </w:rPr>
+        <w:t>ผ่านมุมมอง</w:t>
+      </w:r>
+      <w:r>
+        <w:rPr>
+          <w:rFonts w:cs="Cordia New"/>
+          <w:cs/>
+        </w:rPr>
+        <w:t xml:space="preserve"> </w:t>
+      </w:r>
+      <w:r>
+        <w:rPr>
+          <w:rFonts w:cstheme="minorBidi"/>
+        </w:rPr>
+        <w:t>vw_carrier_freight_summary</w:t>
+      </w:r>
+    </w:p>
+    <w:p>
+      <w:pPr>
+        <w:pBdr>
+          <w:top w:val="nil"/>
+          <w:left w:val="nil"/>
+          <w:bottom w:val="nil"/>
+          <w:right w:val="nil"/>
+          <w:between w:val="nil"/>
+        </w:pBdr>
+        <w:rPr>
+          <w:rFonts w:cstheme="minorBidi"/>
+        </w:rPr>
+      </w:pPr>
+      <w:r>
+        <w:rPr>
+          <w:rFonts w:cs="Cordia New"/>
+          <w:cs/>
+        </w:rPr>
+        <w:t xml:space="preserve">- </w:t>
+      </w:r>
+      <w:r>
+        <w:rPr>
+          <w:rFonts w:cs="Cordia New" w:hint="cs"/>
+          <w:cs/>
+        </w:rPr>
+        <w:t>การคำนวณต้นทุนถัวเฉลี่ยเคลื่อนที่</w:t>
+      </w:r>
+      <w:r>
+        <w:rPr>
+          <w:rFonts w:cs="Cordia New"/>
+          <w:cs/>
+        </w:rPr>
+        <w:t xml:space="preserve"> (</w:t>
+      </w:r>
+      <w:r>
+        <w:rPr>
+          <w:rFonts w:cstheme="minorBidi"/>
+        </w:rPr>
+        <w:t>Moving Average Cost):</w:t>
+      </w:r>
+    </w:p>
+    <w:p>
+      <w:pPr>
+        <w:pBdr>
+          <w:top w:val="nil"/>
+          <w:left w:val="nil"/>
+          <w:bottom w:val="nil"/>
+          <w:right w:val="nil"/>
+          <w:between w:val="nil"/>
+        </w:pBdr>
+        <w:rPr>
           <w:rFonts w:cstheme="minorBidi" w:hint="cs"/>
         </w:rPr>
       </w:pPr>
@@ -6910,14 +6946,14 @@
           <w:rFonts w:cs="Cordia New"/>
           <w:cs/>
         </w:rPr>
-        <w:t xml:space="preserve">- </w:t>
+        <w:t xml:space="preserve">  </w:t>
       </w:r>
       <w:r>
         <w:rPr>
           <w:rFonts w:cs="Cordia New" w:hint="cs"/>
           <w:cs/>
         </w:rPr>
-        <w:t>การรับรู้รายได้</w:t>
+        <w:t>ทุกครั้งที่มีการรับสินค้าเข้าคลัง</w:t>
       </w:r>
       <w:r>
         <w:rPr>
@@ -6930,75 +6966,190 @@
         <w:rPr>
           <w:rFonts w:cstheme="minorBidi"/>
         </w:rPr>
-        <w:t xml:space="preserve">TFRS </w:t>
+        <w:t xml:space="preserve">Goods Receipt </w:t>
+      </w:r>
+      <w:r>
+        <w:rPr>
+          <w:rFonts w:cs="Cordia New" w:hint="cs"/>
+          <w:cs/>
+        </w:rPr>
+        <w:t>ทั้ง</w:t>
       </w:r>
       <w:r>
         <w:rPr>
           <w:rFonts w:cs="Cordia New"/>
           <w:cs/>
         </w:rPr>
-        <w:t xml:space="preserve">15): </w:t>
+        <w:t xml:space="preserve"> </w:t>
+      </w:r>
+      <w:r>
+        <w:rPr>
+          <w:rFonts w:cstheme="minorBidi"/>
+        </w:rPr>
+        <w:t xml:space="preserve">OCR </w:t>
       </w:r>
       <w:r>
         <w:rPr>
           <w:rFonts w:cs="Cordia New" w:hint="cs"/>
           <w:cs/>
         </w:rPr>
-        <w:t>บังคับให้ออกบิลขายด้วยยอดรวมสินค้าเต็มจำนวน</w:t>
+        <w:t>และ</w:t>
       </w:r>
       <w:r>
         <w:rPr>
           <w:rFonts w:cs="Cordia New"/>
           <w:cs/>
         </w:rPr>
+        <w:t xml:space="preserve"> </w:t>
+      </w:r>
+      <w:r>
+        <w:rPr>
+          <w:rFonts w:cstheme="minorBidi"/>
+        </w:rPr>
+        <w:t xml:space="preserve">Manual) </w:t>
+      </w:r>
+      <w:r>
+        <w:rPr>
+          <w:rFonts w:cs="Cordia New" w:hint="cs"/>
+          <w:cs/>
+        </w:rPr>
+        <w:t>หรือการปรับปรุงสต็อกขาเข้า</w:t>
+      </w:r>
+      <w:r>
+        <w:rPr>
+          <w:rFonts w:cs="Cordia New"/>
+          <w:cs/>
+        </w:rPr>
         <w:t xml:space="preserve"> (</w:t>
       </w:r>
       <w:r>
         <w:rPr>
           <w:rFonts w:cstheme="minorBidi"/>
         </w:rPr>
-        <w:t xml:space="preserve">Gross Sales) </w:t>
+        <w:t xml:space="preserve">STK_ADJ </w:t>
       </w:r>
       <w:r>
         <w:rPr>
           <w:rFonts w:cs="Cordia New" w:hint="cs"/>
           <w:cs/>
         </w:rPr>
-        <w:t>ห้ามหักค่าธรรมเนียมแพลตฟอร์มออกจากบิลขายเด็ดขาด</w:t>
+        <w:t>ที่ระบุต้นทุน</w:t>
       </w:r>
       <w:r>
         <w:rPr>
           <w:rFonts w:cs="Cordia New"/>
           <w:cs/>
         </w:rPr>
-        <w:t xml:space="preserve"> </w:t>
+        <w:t xml:space="preserve">) </w:t>
       </w:r>
       <w:r>
         <w:rPr>
           <w:rFonts w:cs="Cordia New" w:hint="cs"/>
           <w:cs/>
         </w:rPr>
-        <w:t>ค่าธรรมเนียมหรือคอมมิชชันจะต้องถูกนำไปตั้งเป็นบิลค่าใช้จ่าย</w:t>
+        <w:t>ระบบต้องดึงยอดคงเหลือทางกายภาพจาก</w:t>
       </w:r>
       <w:r>
         <w:rPr>
           <w:rFonts w:cs="Cordia New"/>
           <w:cs/>
         </w:rPr>
+        <w:t xml:space="preserve"> </w:t>
+      </w:r>
+      <w:r>
+        <w:rPr>
+          <w:rFonts w:cstheme="minorBidi"/>
+        </w:rPr>
+        <w:t>RPC get_on_hand_qty_by_product_ids "</w:t>
+      </w:r>
+      <w:r>
+        <w:rPr>
+          <w:rFonts w:cs="Cordia New" w:hint="cs"/>
+          <w:cs/>
+        </w:rPr>
+        <w:t>ก่อน</w:t>
+      </w:r>
+      <w:r>
+        <w:rPr>
+          <w:rFonts w:cs="Cordia New"/>
+          <w:cs/>
+        </w:rPr>
+        <w:t xml:space="preserve">" </w:t>
+      </w:r>
+      <w:r>
+        <w:rPr>
+          <w:rFonts w:cs="Cordia New" w:hint="cs"/>
+          <w:cs/>
+        </w:rPr>
+        <w:t>การบันทึกรายการรับเข้าใหม่ลง</w:t>
+      </w:r>
+      <w:r>
+        <w:rPr>
+          <w:rFonts w:cs="Cordia New"/>
+          <w:cs/>
+        </w:rPr>
+        <w:t xml:space="preserve"> </w:t>
+      </w:r>
+      <w:r>
+        <w:rPr>
+          <w:rFonts w:cstheme="minorBidi"/>
+        </w:rPr>
+        <w:t xml:space="preserve">inventory_ledger </w:t>
+      </w:r>
+      <w:r>
+        <w:rPr>
+          <w:rFonts w:cs="Cordia New" w:hint="cs"/>
+          <w:cs/>
+        </w:rPr>
+        <w:t>เสมอ</w:t>
+      </w:r>
+      <w:r>
+        <w:rPr>
+          <w:rFonts w:cs="Cordia New"/>
+          <w:cs/>
+        </w:rPr>
+        <w:t xml:space="preserve"> </w:t>
+      </w:r>
+      <w:r>
+        <w:rPr>
+          <w:rFonts w:cs="Cordia New" w:hint="cs"/>
+          <w:cs/>
+        </w:rPr>
+        <w:t>เพื่อนำมาถัวเฉลี่ยกับต้นทุนล็อตใหม่</w:t>
+      </w:r>
+      <w:r>
+        <w:rPr>
+          <w:rFonts w:cs="Cordia New"/>
+          <w:cs/>
+        </w:rPr>
         <w:t xml:space="preserve"> (</w:t>
       </w:r>
       <w:r>
         <w:rPr>
+          <w:rFonts w:cs="Cordia New" w:hint="cs"/>
+          <w:cs/>
+        </w:rPr>
+        <w:t>หลังแปลงหน่วยนับจัดซื้อเป็นหน่วยฐานด้วย</w:t>
+      </w:r>
+      <w:r>
+        <w:rPr>
+          <w:rFonts w:cs="Cordia New"/>
+          <w:cs/>
+        </w:rPr>
+        <w:t xml:space="preserve"> </w:t>
+      </w:r>
+      <w:r>
+        <w:rPr>
           <w:rFonts w:cstheme="minorBidi"/>
         </w:rPr>
-        <w:t xml:space="preserve">EXP) </w:t>
+        <w:t xml:space="preserve">uom_conversion_factor) </w:t>
       </w:r>
       <w:r>
         <w:rPr>
           <w:rFonts w:cs="Cordia New" w:hint="cs"/>
           <w:cs/>
         </w:rPr>
-        <w:t>แยกต่างหาก</w:t>
+        <w:t>แล้วจึงอัปเดตลง</w:t>
       </w:r>
       <w:r>
         <w:rPr>
@@ -7009,10 +7160,9 @@
       </w:r>
       <w:r>
         <w:rPr>
-          <w:rFonts w:cs="Cordia New" w:hint="cs"/>
-          <w:cs/>
-        </w:rPr>
-        <w:t>เพื่อความถูกต้องของการนำส่งภาษี</w:t>
+          <w:rFonts w:cstheme="minorBidi"/>
+        </w:rPr>
+        <w:t>products.cost_price</w:t>
       </w:r>
     </w:p>
     <w:sectPr>

</xml_diff>